<commit_message>
feat: update thesis documentation (Chapters 1-5 & Appendix), TinyML model (Subjects 17-20), firmware, and dataset
</commit_message>
<xml_diff>
--- a/Document/Template ปริญญานิพนธ์/09 บรรณานุกรม.docx
+++ b/Document/Template ปริญญานิพนธ์/09 บรรณานุกรม.docx
@@ -2,764 +2,6 @@
 <file path=word/document.xml><?xml version="1.0" encoding="utf-8"?>
 <w:document xmlns:wpc="http://schemas.microsoft.com/office/word/2010/wordprocessingCanvas" xmlns:cx="http://schemas.microsoft.com/office/drawing/2014/chartex" xmlns:cx1="http://schemas.microsoft.com/office/drawing/2015/9/8/chartex" xmlns:cx2="http://schemas.microsoft.com/office/drawing/2015/10/21/chartex" xmlns:cx3="http://schemas.microsoft.com/office/drawing/2016/5/9/chartex" xmlns:cx4="http://schemas.microsoft.com/office/drawing/2016/5/10/chartex" xmlns:cx5="http://schemas.microsoft.com/office/drawing/2016/5/11/chartex" xmlns:cx6="http://schemas.microsoft.com/office/drawing/2016/5/12/chartex" xmlns:cx7="http://schemas.microsoft.com/office/drawing/2016/5/13/chartex" xmlns:cx8="http://schemas.microsoft.com/office/drawing/2016/5/14/chartex" xmlns:mc="http://schemas.openxmlformats.org/markup-compatibility/2006" xmlns:aink="http://schemas.microsoft.com/office/drawing/2016/ink" xmlns:am3d="http://schemas.microsoft.com/office/drawing/2017/model3d" xmlns:o="urn:schemas-microsoft-com:office:office" xmlns:oel="http://schemas.microsoft.com/office/2019/extlst" xmlns:r="http://schemas.openxmlformats.org/officeDocument/2006/relationships" xmlns:m="http://schemas.openxmlformats.org/officeDocument/2006/math" xmlns:v="urn:schemas-microsoft-com:vml" xmlns:wp14="http://schemas.microsoft.com/office/word/2010/wordprocessingDrawing" xmlns:wp="http://schemas.openxmlformats.org/drawingml/2006/wordprocessingDrawing" xmlns:w10="urn:schemas-microsoft-com:office:word" xmlns:w="http://schemas.openxmlformats.org/wordprocessingml/2006/main" xmlns:w14="http://schemas.microsoft.com/office/word/2010/wordml" xmlns:w15="http://schemas.microsoft.com/office/word/2012/wordml" xmlns:w16cex="http://schemas.microsoft.com/office/word/2018/wordml/cex" xmlns:w16cid="http://schemas.microsoft.com/office/word/2016/wordml/cid" xmlns:w16="http://schemas.microsoft.com/office/word/2018/wordml" xmlns:w16du="http://schemas.microsoft.com/office/word/2023/wordml/word16du" xmlns:w16sdtdh="http://schemas.microsoft.com/office/word/2020/wordml/sdtdatahash" xmlns:w16sdtfl="http://schemas.microsoft.com/office/word/2024/wordml/sdtformatlock" xmlns:w16se="http://schemas.microsoft.com/office/word/2015/wordml/symex" xmlns:wpg="http://schemas.microsoft.com/office/word/2010/wordprocessingGroup" xmlns:wpi="http://schemas.microsoft.com/office/word/2010/wordprocessingInk" xmlns:wne="http://schemas.microsoft.com/office/word/2006/wordml" xmlns:wps="http://schemas.microsoft.com/office/word/2010/wordprocessingShape" mc:Ignorable="w14 w15 w16se w16cid w16 w16cex w16sdtdh w16sdtfl w16du wp14">
   <w:body>
-    <w:sdt>
-      <w:sdtPr>
-        <w:rPr>
-          <w:rFonts w:eastAsiaTheme="minorEastAsia"/>
-          <w:b w:val="0"/>
-          <w:bCs w:val="0"/>
-          <w:sz w:val="32"/>
-          <w:szCs w:val="32"/>
-          <w:cs w:val="0"/>
-          <w:lang w:val="th-TH"/>
-        </w:rPr>
-        <w:id w:val="-315037431"/>
-        <w:docPartObj>
-          <w:docPartGallery w:val="Bibliographies"/>
-          <w:docPartUnique/>
-        </w:docPartObj>
-      </w:sdtPr>
-      <w:sdtEndPr>
-        <w:rPr>
-          <w:lang w:val="en-US"/>
-        </w:rPr>
-      </w:sdtEndPr>
-      <w:sdtContent>
-        <w:p>
-          <w:pPr>
-            <w:pStyle w:val="1"/>
-            <w:spacing w:before="0" w:line="240" w:lineRule="auto"/>
-            <w:jc w:val="center"/>
-            <w:rPr>
-              <w:sz w:val="32"/>
-              <w:szCs w:val="32"/>
-              <w:lang w:val="th-TH"/>
-            </w:rPr>
-          </w:pPr>
-          <w:r>
-            <w:rPr>
-              <w:sz w:val="32"/>
-              <w:szCs w:val="32"/>
-              <w:lang w:val="th-TH"/>
-            </w:rPr>
-            <w:t>บรรณานุกรม</w:t>
-          </w:r>
-        </w:p>
-        <w:p>
-          <w:pPr>
-            <w:spacing w:line="240" w:lineRule="auto"/>
-            <w:rPr>
-              <w:lang w:val="th-TH"/>
-            </w:rPr>
-          </w:pPr>
-        </w:p>
-        <w:sdt>
-          <w:sdtPr>
-            <w:rPr>
-              <w:rFonts w:ascii="TH SarabunPSK" w:hAnsi="TH SarabunPSK" w:cs="TH SarabunPSK"/>
-              <w:sz w:val="32"/>
-              <w:szCs w:val="32"/>
-            </w:rPr>
-            <w:id w:val="111145805"/>
-            <w:bibliography/>
-          </w:sdtPr>
-          <w:sdtContent>
-            <w:p>
-              <w:pPr>
-                <w:pStyle w:val="a9"/>
-                <w:spacing w:line="240" w:lineRule="auto"/>
-                <w:ind w:left="720" w:hanging="720"/>
-                <w:rPr>
-                  <w:rFonts w:ascii="TH SarabunPSK" w:hAnsi="TH SarabunPSK" w:cs="TH SarabunPSK"/>
-                  <w:sz w:val="32"/>
-                  <w:szCs w:val="32"/>
-                </w:rPr>
-              </w:pPr>
-              <w:r>
-                <w:rPr>
-                  <w:rFonts w:ascii="TH SarabunPSK" w:hAnsi="TH SarabunPSK" w:cs="TH SarabunPSK"/>
-                  <w:sz w:val="32"/>
-                  <w:szCs w:val="32"/>
-                  <w:cs/>
-                </w:rPr>
-                <w:t>กรมกิจการผู้สูงอายุ.</w:t>
-              </w:r>
-              <w:r>
-                <w:rPr>
-                  <w:rFonts w:ascii="TH SarabunPSK" w:hAnsi="TH SarabunPSK" w:cs="TH SarabunPSK"/>
-                  <w:sz w:val="32"/>
-                  <w:szCs w:val="32"/>
-                </w:rPr>
-                <w:t xml:space="preserve"> (2564). </w:t>
-              </w:r>
-              <w:r>
-                <w:rPr>
-                  <w:rFonts w:ascii="TH SarabunPSK" w:hAnsi="TH SarabunPSK" w:cs="TH SarabunPSK"/>
-                  <w:i/>
-                  <w:iCs/>
-                  <w:sz w:val="32"/>
-                  <w:szCs w:val="32"/>
-                  <w:cs/>
-                </w:rPr>
-                <w:t xml:space="preserve">สถิติผู้สูงอายุของประเทศไทย </w:t>
-              </w:r>
-              <w:r>
-                <w:rPr>
-                  <w:rFonts w:ascii="TH SarabunPSK" w:hAnsi="TH SarabunPSK" w:cs="TH SarabunPSK"/>
-                  <w:i/>
-                  <w:iCs/>
-                  <w:sz w:val="32"/>
-                  <w:szCs w:val="32"/>
-                </w:rPr>
-                <w:t xml:space="preserve">77 </w:t>
-              </w:r>
-              <w:r>
-                <w:rPr>
-                  <w:rFonts w:ascii="TH SarabunPSK" w:hAnsi="TH SarabunPSK" w:cs="TH SarabunPSK"/>
-                  <w:i/>
-                  <w:iCs/>
-                  <w:sz w:val="32"/>
-                  <w:szCs w:val="32"/>
-                  <w:cs/>
-                </w:rPr>
-                <w:t xml:space="preserve">จังหวัด ประจำปี </w:t>
-              </w:r>
-              <w:r>
-                <w:rPr>
-                  <w:rFonts w:ascii="TH SarabunPSK" w:hAnsi="TH SarabunPSK" w:cs="TH SarabunPSK"/>
-                  <w:i/>
-                  <w:iCs/>
-                  <w:sz w:val="32"/>
-                  <w:szCs w:val="32"/>
-                </w:rPr>
-                <w:t>2564</w:t>
-              </w:r>
-              <w:r>
-                <w:rPr>
-                  <w:rFonts w:ascii="TH SarabunPSK" w:hAnsi="TH SarabunPSK" w:cs="TH SarabunPSK"/>
-                  <w:sz w:val="32"/>
-                  <w:szCs w:val="32"/>
-                </w:rPr>
-                <w:t xml:space="preserve">. </w:t>
-              </w:r>
-              <w:r>
-                <w:rPr>
-                  <w:rFonts w:ascii="TH SarabunPSK" w:hAnsi="TH SarabunPSK" w:cs="TH SarabunPSK"/>
-                  <w:sz w:val="32"/>
-                  <w:szCs w:val="32"/>
-                  <w:cs/>
-                </w:rPr>
-                <w:t>กระทรวงการพัฒนาสังคมและความมั่นคงของมนุษย์.</w:t>
-              </w:r>
-              <w:r>
-                <w:rPr>
-                  <w:rFonts w:ascii="TH SarabunPSK" w:hAnsi="TH SarabunPSK" w:cs="TH SarabunPSK"/>
-                  <w:sz w:val="32"/>
-                  <w:szCs w:val="32"/>
-                </w:rPr>
-                <w:t xml:space="preserve"> </w:t>
-              </w:r>
-              <w:hyperlink r:id="rId10" w:history="1">
-                <w:r>
-                  <w:rPr>
-                    <w:rStyle w:val="a7"/>
-                    <w:rFonts w:ascii="TH SarabunPSK" w:hAnsi="TH SarabunPSK" w:cs="TH SarabunPSK"/>
-                    <w:sz w:val="32"/>
-                    <w:szCs w:val="32"/>
-                  </w:rPr>
-                  <w:t>https://www.dop.go.th/th/know/side/1/1/1159</w:t>
-                </w:r>
-              </w:hyperlink>
-            </w:p>
-            <w:p>
-              <w:pPr>
-                <w:pStyle w:val="a9"/>
-                <w:ind w:left="720" w:hanging="720"/>
-                <w:rPr>
-                  <w:rFonts w:ascii="TH SarabunPSK" w:hAnsi="TH SarabunPSK" w:cs="TH SarabunPSK"/>
-                  <w:sz w:val="32"/>
-                  <w:szCs w:val="32"/>
-                </w:rPr>
-              </w:pPr>
-              <w:r>
-                <w:rPr>
-                  <w:rFonts w:ascii="TH SarabunPSK" w:hAnsi="TH SarabunPSK" w:cs="TH SarabunPSK"/>
-                  <w:sz w:val="32"/>
-                  <w:szCs w:val="32"/>
-                  <w:cs/>
-                </w:rPr>
-                <w:t>กรมควบคุมโรค.</w:t>
-              </w:r>
-              <w:r>
-                <w:rPr>
-                  <w:rFonts w:ascii="TH SarabunPSK" w:hAnsi="TH SarabunPSK" w:cs="TH SarabunPSK"/>
-                  <w:sz w:val="32"/>
-                  <w:szCs w:val="32"/>
-                </w:rPr>
-                <w:t xml:space="preserve"> (2565). </w:t>
-              </w:r>
-              <w:r>
-                <w:rPr>
-                  <w:rFonts w:ascii="TH SarabunPSK" w:hAnsi="TH SarabunPSK" w:cs="TH SarabunPSK"/>
-                  <w:i/>
-                  <w:iCs/>
-                  <w:sz w:val="32"/>
-                  <w:szCs w:val="32"/>
-                  <w:cs/>
-                </w:rPr>
-                <w:t>รายงานสถานการณ์การพลัดตกหกล้มของผู้สูงอายุในประเทศไทย</w:t>
-              </w:r>
-              <w:r>
-                <w:rPr>
-                  <w:rFonts w:ascii="TH SarabunPSK" w:hAnsi="TH SarabunPSK" w:cs="TH SarabunPSK"/>
-                  <w:sz w:val="32"/>
-                  <w:szCs w:val="32"/>
-                </w:rPr>
-                <w:t xml:space="preserve">. </w:t>
-              </w:r>
-              <w:r>
-                <w:rPr>
-                  <w:rFonts w:ascii="TH SarabunPSK" w:hAnsi="TH SarabunPSK" w:cs="TH SarabunPSK"/>
-                  <w:sz w:val="32"/>
-                  <w:szCs w:val="32"/>
-                  <w:cs/>
-                </w:rPr>
-                <w:t>สำนักโรคไม่ติดต่อ</w:t>
-              </w:r>
-              <w:r>
-                <w:rPr>
-                  <w:rFonts w:ascii="TH SarabunPSK" w:hAnsi="TH SarabunPSK" w:cs="TH SarabunPSK"/>
-                  <w:sz w:val="32"/>
-                  <w:szCs w:val="32"/>
-                </w:rPr>
-                <w:t xml:space="preserve"> </w:t>
-              </w:r>
-              <w:r>
-                <w:rPr>
-                  <w:rFonts w:ascii="TH SarabunPSK" w:hAnsi="TH SarabunPSK" w:cs="TH SarabunPSK"/>
-                  <w:sz w:val="32"/>
-                  <w:szCs w:val="32"/>
-                  <w:cs/>
-                </w:rPr>
-                <w:t>กรมควบคุมโรค</w:t>
-              </w:r>
-              <w:r>
-                <w:rPr>
-                  <w:rFonts w:ascii="TH SarabunPSK" w:hAnsi="TH SarabunPSK" w:cs="TH SarabunPSK"/>
-                  <w:sz w:val="32"/>
-                  <w:szCs w:val="32"/>
-                </w:rPr>
-                <w:t xml:space="preserve"> </w:t>
-              </w:r>
-              <w:r>
-                <w:rPr>
-                  <w:rFonts w:ascii="TH SarabunPSK" w:hAnsi="TH SarabunPSK" w:cs="TH SarabunPSK"/>
-                  <w:sz w:val="32"/>
-                  <w:szCs w:val="32"/>
-                  <w:cs/>
-                </w:rPr>
-                <w:t>กระทรวงสาธารณสุข.</w:t>
-              </w:r>
-              <w:r>
-                <w:rPr>
-                  <w:rFonts w:ascii="TH SarabunPSK" w:hAnsi="TH SarabunPSK" w:cs="TH SarabunPSK"/>
-                  <w:sz w:val="32"/>
-                  <w:szCs w:val="32"/>
-                </w:rPr>
-                <w:t xml:space="preserve"> </w:t>
-              </w:r>
-              <w:hyperlink r:id="rId11" w:history="1">
-                <w:r>
-                  <w:rPr>
-                    <w:rStyle w:val="a7"/>
-                    <w:rFonts w:ascii="TH SarabunPSK" w:hAnsi="TH SarabunPSK" w:cs="TH SarabunPSK"/>
-                    <w:sz w:val="32"/>
-                    <w:szCs w:val="32"/>
-                  </w:rPr>
-                  <w:t>https://ddc.moph.go.th/th/site/office/view/noncommunicable</w:t>
-                </w:r>
-              </w:hyperlink>
-            </w:p>
-            <w:p>
-              <w:pPr>
-                <w:pStyle w:val="a9"/>
-                <w:ind w:left="720" w:hanging="720"/>
-                <w:rPr>
-                  <w:rFonts w:ascii="TH SarabunPSK" w:hAnsi="TH SarabunPSK" w:cs="TH SarabunPSK"/>
-                  <w:sz w:val="32"/>
-                  <w:szCs w:val="32"/>
-                </w:rPr>
-              </w:pPr>
-              <w:r>
-                <w:rPr>
-                  <w:rFonts w:ascii="TH SarabunPSK" w:hAnsi="TH SarabunPSK" w:cs="TH SarabunPSK"/>
-                  <w:sz w:val="32"/>
-                  <w:szCs w:val="32"/>
-                  <w:cs/>
-                </w:rPr>
-                <w:t>พรเทพ</w:t>
-              </w:r>
-              <w:r>
-                <w:rPr>
-                  <w:rFonts w:ascii="TH SarabunPSK" w:hAnsi="TH SarabunPSK" w:cs="TH SarabunPSK"/>
-                  <w:sz w:val="32"/>
-                  <w:szCs w:val="32"/>
-                </w:rPr>
-                <w:t xml:space="preserve"> </w:t>
-              </w:r>
-              <w:r>
-                <w:rPr>
-                  <w:rFonts w:ascii="TH SarabunPSK" w:hAnsi="TH SarabunPSK" w:cs="TH SarabunPSK"/>
-                  <w:sz w:val="32"/>
-                  <w:szCs w:val="32"/>
-                  <w:cs/>
-                </w:rPr>
-                <w:t>พงศ์นาม.</w:t>
-              </w:r>
-              <w:r>
-                <w:rPr>
-                  <w:rFonts w:ascii="TH SarabunPSK" w:hAnsi="TH SarabunPSK" w:cs="TH SarabunPSK"/>
-                  <w:sz w:val="32"/>
-                  <w:szCs w:val="32"/>
-                </w:rPr>
-                <w:t xml:space="preserve"> (2568). </w:t>
-              </w:r>
-              <w:r>
-                <w:rPr>
-                  <w:rFonts w:ascii="TH SarabunPSK" w:hAnsi="TH SarabunPSK" w:cs="TH SarabunPSK"/>
-                  <w:sz w:val="32"/>
-                  <w:szCs w:val="32"/>
-                  <w:cs/>
-                </w:rPr>
-                <w:t>การประยุกต์ใช้ปัญญาประดิษฐ์ฝังตัวเพื่อการวิเคราะห์ทางชีวกลศาสตร์และการจำแนกเหตุการณ์แบบเรียลไทม์.</w:t>
-              </w:r>
-              <w:r>
-                <w:rPr>
-                  <w:rFonts w:ascii="TH SarabunPSK" w:hAnsi="TH SarabunPSK" w:cs="TH SarabunPSK"/>
-                  <w:sz w:val="32"/>
-                  <w:szCs w:val="32"/>
-                </w:rPr>
-                <w:t xml:space="preserve"> </w:t>
-              </w:r>
-              <w:r>
-                <w:rPr>
-                  <w:rFonts w:ascii="TH SarabunPSK" w:hAnsi="TH SarabunPSK" w:cs="TH SarabunPSK"/>
-                  <w:i/>
-                  <w:iCs/>
-                  <w:sz w:val="32"/>
-                  <w:szCs w:val="32"/>
-                  <w:cs/>
-                </w:rPr>
-                <w:t>วารสารวิศวกรรมและวิทยาศาสตร์ประยุกต์</w:t>
-              </w:r>
-              <w:r>
-                <w:rPr>
-                  <w:rFonts w:ascii="TH SarabunPSK" w:hAnsi="TH SarabunPSK" w:cs="TH SarabunPSK"/>
-                  <w:sz w:val="32"/>
-                  <w:szCs w:val="32"/>
-                </w:rPr>
-                <w:t xml:space="preserve">, </w:t>
-              </w:r>
-              <w:r>
-                <w:rPr>
-                  <w:rFonts w:ascii="TH SarabunPSK" w:hAnsi="TH SarabunPSK" w:cs="TH SarabunPSK"/>
-                  <w:i/>
-                  <w:iCs/>
-                  <w:sz w:val="32"/>
-                  <w:szCs w:val="32"/>
-                </w:rPr>
-                <w:t>18</w:t>
-              </w:r>
-              <w:r>
-                <w:rPr>
-                  <w:rFonts w:ascii="TH SarabunPSK" w:hAnsi="TH SarabunPSK" w:cs="TH SarabunPSK"/>
-                  <w:sz w:val="32"/>
-                  <w:szCs w:val="32"/>
-                </w:rPr>
-                <w:t>(2), 145-158.</w:t>
-              </w:r>
-            </w:p>
-            <w:p>
-              <w:pPr>
-                <w:pStyle w:val="a9"/>
-                <w:spacing w:line="240" w:lineRule="auto"/>
-                <w:ind w:left="720" w:hanging="720"/>
-                <w:rPr>
-                  <w:rFonts w:ascii="TH SarabunPSK" w:hAnsi="TH SarabunPSK" w:cs="TH SarabunPSK"/>
-                  <w:sz w:val="32"/>
-                  <w:szCs w:val="32"/>
-                </w:rPr>
-              </w:pPr>
-              <w:r>
-                <w:rPr>
-                  <w:rFonts w:ascii="TH SarabunPSK" w:hAnsi="TH SarabunPSK" w:cs="TH SarabunPSK"/>
-                  <w:sz w:val="32"/>
-                  <w:szCs w:val="32"/>
-                </w:rPr>
-                <w:t>[</w:t>
-              </w:r>
-              <w:r>
-                <w:rPr>
-                  <w:rFonts w:ascii="TH SarabunPSK" w:hAnsi="TH SarabunPSK" w:cs="TH SarabunPSK"/>
-                  <w:sz w:val="32"/>
-                  <w:szCs w:val="32"/>
-                </w:rPr>
-                <w:t xml:space="preserve">Angelini, G. F. (2022). </w:t>
-              </w:r>
-              <w:proofErr w:type="spellStart"/>
-              <w:r>
-                <w:rPr>
-                  <w:rFonts w:ascii="TH SarabunPSK" w:hAnsi="TH SarabunPSK" w:cs="TH SarabunPSK"/>
-                  <w:sz w:val="32"/>
-                  <w:szCs w:val="32"/>
-                </w:rPr>
-                <w:t>TinyML</w:t>
-              </w:r>
-              <w:proofErr w:type="spellEnd"/>
-              <w:r>
-                <w:rPr>
-                  <w:rFonts w:ascii="TH SarabunPSK" w:hAnsi="TH SarabunPSK" w:cs="TH SarabunPSK"/>
-                  <w:sz w:val="32"/>
-                  <w:szCs w:val="32"/>
-                </w:rPr>
-                <w:t xml:space="preserve"> for healthcare: Wearable fall detection system using ESP32 and microcontroller-based artificial neural networks. </w:t>
-              </w:r>
-              <w:r>
-                <w:rPr>
-                  <w:rFonts w:ascii="TH SarabunPSK" w:hAnsi="TH SarabunPSK" w:cs="TH SarabunPSK"/>
-                  <w:i/>
-                  <w:iCs/>
-                  <w:sz w:val="32"/>
-                  <w:szCs w:val="32"/>
-                </w:rPr>
-                <w:t>IEEE Internet of Things Journal</w:t>
-              </w:r>
-              <w:r>
-                <w:rPr>
-                  <w:rFonts w:ascii="TH SarabunPSK" w:hAnsi="TH SarabunPSK" w:cs="TH SarabunPSK"/>
-                  <w:sz w:val="32"/>
-                  <w:szCs w:val="32"/>
-                </w:rPr>
-                <w:t xml:space="preserve">, </w:t>
-              </w:r>
-              <w:r>
-                <w:rPr>
-                  <w:rFonts w:ascii="TH SarabunPSK" w:hAnsi="TH SarabunPSK" w:cs="TH SarabunPSK"/>
-                  <w:i/>
-                  <w:iCs/>
-                  <w:sz w:val="32"/>
-                  <w:szCs w:val="32"/>
-                </w:rPr>
-                <w:t>9</w:t>
-              </w:r>
-              <w:r>
-                <w:rPr>
-                  <w:rFonts w:ascii="TH SarabunPSK" w:hAnsi="TH SarabunPSK" w:cs="TH SarabunPSK"/>
-                  <w:sz w:val="32"/>
-                  <w:szCs w:val="32"/>
-                </w:rPr>
-                <w:t xml:space="preserve">(14), 12050-12061. </w:t>
-              </w:r>
-              <w:hyperlink r:id="rId12" w:history="1">
-                <w:r>
-                  <w:rPr>
-                    <w:rStyle w:val="a7"/>
-                    <w:rFonts w:ascii="TH SarabunPSK" w:hAnsi="TH SarabunPSK" w:cs="TH SarabunPSK"/>
-                    <w:sz w:val="32"/>
-                    <w:szCs w:val="32"/>
-                  </w:rPr>
-                  <w:t>https://doi.org/10.1109/JIOT.2022.3151812</w:t>
-                </w:r>
-              </w:hyperlink>
-            </w:p>
-            <w:p>
-              <w:pPr>
-                <w:pStyle w:val="a9"/>
-                <w:ind w:left="720" w:hanging="720"/>
-                <w:rPr>
-                  <w:rFonts w:ascii="TH SarabunPSK" w:hAnsi="TH SarabunPSK" w:cs="TH SarabunPSK"/>
-                  <w:sz w:val="32"/>
-                  <w:szCs w:val="32"/>
-                </w:rPr>
-              </w:pPr>
-              <w:proofErr w:type="spellStart"/>
-              <w:r>
-                <w:rPr>
-                  <w:rFonts w:ascii="TH SarabunPSK" w:hAnsi="TH SarabunPSK" w:cs="TH SarabunPSK"/>
-                  <w:sz w:val="32"/>
-                  <w:szCs w:val="32"/>
-                </w:rPr>
-                <w:t>Bagalà</w:t>
-              </w:r>
-              <w:proofErr w:type="spellEnd"/>
-              <w:r>
-                <w:rPr>
-                  <w:rFonts w:ascii="TH SarabunPSK" w:hAnsi="TH SarabunPSK" w:cs="TH SarabunPSK"/>
-                  <w:sz w:val="32"/>
-                  <w:szCs w:val="32"/>
-                </w:rPr>
-                <w:t xml:space="preserve">, F., Becker, C., Cappello, A., Chiari, L., Aminian, K., Hausdorff, J. M., Zijlstra, W., &amp; Klenk, J. (2012). Evaluation of accelerometer-based fall detection algorithms on real-world falls. </w:t>
-              </w:r>
-              <w:r>
-                <w:rPr>
-                  <w:rFonts w:ascii="TH SarabunPSK" w:hAnsi="TH SarabunPSK" w:cs="TH SarabunPSK"/>
-                  <w:i/>
-                  <w:iCs/>
-                  <w:sz w:val="32"/>
-                  <w:szCs w:val="32"/>
-                </w:rPr>
-                <w:t>PLOS ONE</w:t>
-              </w:r>
-              <w:r>
-                <w:rPr>
-                  <w:rFonts w:ascii="TH SarabunPSK" w:hAnsi="TH SarabunPSK" w:cs="TH SarabunPSK"/>
-                  <w:sz w:val="32"/>
-                  <w:szCs w:val="32"/>
-                </w:rPr>
-                <w:t xml:space="preserve">, </w:t>
-              </w:r>
-              <w:r>
-                <w:rPr>
-                  <w:rFonts w:ascii="TH SarabunPSK" w:hAnsi="TH SarabunPSK" w:cs="TH SarabunPSK"/>
-                  <w:i/>
-                  <w:iCs/>
-                  <w:sz w:val="32"/>
-                  <w:szCs w:val="32"/>
-                </w:rPr>
-                <w:t>7</w:t>
-              </w:r>
-              <w:r>
-                <w:rPr>
-                  <w:rFonts w:ascii="TH SarabunPSK" w:hAnsi="TH SarabunPSK" w:cs="TH SarabunPSK"/>
-                  <w:sz w:val="32"/>
-                  <w:szCs w:val="32"/>
-                </w:rPr>
-                <w:t xml:space="preserve">(5), Article e37062. </w:t>
-              </w:r>
-              <w:hyperlink r:id="rId13" w:history="1">
-                <w:r>
-                  <w:rPr>
-                    <w:rStyle w:val="a7"/>
-                    <w:rFonts w:ascii="TH SarabunPSK" w:hAnsi="TH SarabunPSK" w:cs="TH SarabunPSK"/>
-                    <w:sz w:val="32"/>
-                    <w:szCs w:val="32"/>
-                  </w:rPr>
-                  <w:t>https://doi.org/10.1371/journal.pone.0037062</w:t>
-                </w:r>
-              </w:hyperlink>
-            </w:p>
-            <w:p>
-              <w:pPr>
-                <w:pStyle w:val="a9"/>
-                <w:ind w:left="720" w:hanging="720"/>
-                <w:rPr>
-                  <w:rFonts w:ascii="TH SarabunPSK" w:hAnsi="TH SarabunPSK" w:cs="TH SarabunPSK"/>
-                  <w:sz w:val="32"/>
-                  <w:szCs w:val="32"/>
-                </w:rPr>
-              </w:pPr>
-              <w:proofErr w:type="spellStart"/>
-              <w:r>
-                <w:rPr>
-                  <w:rFonts w:ascii="TH SarabunPSK" w:hAnsi="TH SarabunPSK" w:cs="TH SarabunPSK"/>
-                  <w:sz w:val="32"/>
-                  <w:szCs w:val="32"/>
-                </w:rPr>
-                <w:t>Espressif</w:t>
-              </w:r>
-              <w:proofErr w:type="spellEnd"/>
-              <w:r>
-                <w:rPr>
-                  <w:rFonts w:ascii="TH SarabunPSK" w:hAnsi="TH SarabunPSK" w:cs="TH SarabunPSK"/>
-                  <w:sz w:val="32"/>
-                  <w:szCs w:val="32"/>
-                </w:rPr>
-                <w:t xml:space="preserve"> Systems. (2024). </w:t>
-              </w:r>
-              <w:r>
-                <w:rPr>
-                  <w:rFonts w:ascii="TH SarabunPSK" w:hAnsi="TH SarabunPSK" w:cs="TH SarabunPSK"/>
-                  <w:i/>
-                  <w:iCs/>
-                  <w:sz w:val="32"/>
-                  <w:szCs w:val="32"/>
-                </w:rPr>
-                <w:t>ESP32 series datasheet: 2.4 GHz Wi-Fi and Bluetooth combo chip</w:t>
-              </w:r>
-              <w:r>
-                <w:rPr>
-                  <w:rFonts w:ascii="TH SarabunPSK" w:hAnsi="TH SarabunPSK" w:cs="TH SarabunPSK"/>
-                  <w:sz w:val="32"/>
-                  <w:szCs w:val="32"/>
-                </w:rPr>
-                <w:t xml:space="preserve"> (Version 4.4). </w:t>
-              </w:r>
-              <w:proofErr w:type="spellStart"/>
-              <w:r>
-                <w:rPr>
-                  <w:rFonts w:ascii="TH SarabunPSK" w:hAnsi="TH SarabunPSK" w:cs="TH SarabunPSK"/>
-                  <w:sz w:val="32"/>
-                  <w:szCs w:val="32"/>
-                </w:rPr>
-                <w:t>Espressif</w:t>
-              </w:r>
-              <w:proofErr w:type="spellEnd"/>
-              <w:r>
-                <w:rPr>
-                  <w:rFonts w:ascii="TH SarabunPSK" w:hAnsi="TH SarabunPSK" w:cs="TH SarabunPSK"/>
-                  <w:sz w:val="32"/>
-                  <w:szCs w:val="32"/>
-                </w:rPr>
-                <w:t xml:space="preserve"> Systems Co., Ltd. </w:t>
-              </w:r>
-              <w:hyperlink r:id="rId14" w:history="1">
-                <w:r>
-                  <w:rPr>
-                    <w:rStyle w:val="a7"/>
-                    <w:rFonts w:ascii="TH SarabunPSK" w:hAnsi="TH SarabunPSK" w:cs="TH SarabunPSK"/>
-                    <w:sz w:val="32"/>
-                    <w:szCs w:val="32"/>
-                  </w:rPr>
-                  <w:t>https://www.espressif.com/sites/default/files/documentation/esp32_datasheet_en.pdf</w:t>
-                </w:r>
-              </w:hyperlink>
-            </w:p>
-            <w:p>
-              <w:pPr>
-                <w:pStyle w:val="a9"/>
-                <w:ind w:left="720" w:hanging="720"/>
-                <w:rPr>
-                  <w:rFonts w:ascii="TH SarabunPSK" w:hAnsi="TH SarabunPSK" w:cs="TH SarabunPSK"/>
-                  <w:sz w:val="32"/>
-                  <w:szCs w:val="32"/>
-                </w:rPr>
-              </w:pPr>
-              <w:r>
-                <w:rPr>
-                  <w:rFonts w:ascii="TH SarabunPSK" w:hAnsi="TH SarabunPSK" w:cs="TH SarabunPSK"/>
-                  <w:sz w:val="32"/>
-                  <w:szCs w:val="32"/>
-                </w:rPr>
-                <w:t xml:space="preserve">Han, J., Pei, J., &amp; Tong, H. (2022). </w:t>
-              </w:r>
-              <w:r>
-                <w:rPr>
-                  <w:rFonts w:ascii="TH SarabunPSK" w:hAnsi="TH SarabunPSK" w:cs="TH SarabunPSK"/>
-                  <w:i/>
-                  <w:iCs/>
-                  <w:sz w:val="32"/>
-                  <w:szCs w:val="32"/>
-                </w:rPr>
-                <w:t>Data mining: Concepts and techniques</w:t>
-              </w:r>
-              <w:r>
-                <w:rPr>
-                  <w:rFonts w:ascii="TH SarabunPSK" w:hAnsi="TH SarabunPSK" w:cs="TH SarabunPSK"/>
-                  <w:sz w:val="32"/>
-                  <w:szCs w:val="32"/>
-                </w:rPr>
-                <w:t xml:space="preserve"> (4th ed.). Morgan Kaufmann.</w:t>
-              </w:r>
-            </w:p>
-            <w:p>
-              <w:pPr>
-                <w:pStyle w:val="a9"/>
-                <w:ind w:left="720" w:hanging="720"/>
-                <w:rPr>
-                  <w:rFonts w:ascii="TH SarabunPSK" w:hAnsi="TH SarabunPSK" w:cs="TH SarabunPSK"/>
-                  <w:sz w:val="32"/>
-                  <w:szCs w:val="32"/>
-                </w:rPr>
-              </w:pPr>
-              <w:r>
-                <w:rPr>
-                  <w:rFonts w:ascii="TH SarabunPSK" w:hAnsi="TH SarabunPSK" w:cs="TH SarabunPSK"/>
-                  <w:sz w:val="32"/>
-                  <w:szCs w:val="32"/>
-                </w:rPr>
-                <w:t xml:space="preserve">Hussain, F., Khan, M. B., &amp; </w:t>
-              </w:r>
-              <w:proofErr w:type="spellStart"/>
-              <w:r>
-                <w:rPr>
-                  <w:rFonts w:ascii="TH SarabunPSK" w:hAnsi="TH SarabunPSK" w:cs="TH SarabunPSK"/>
-                  <w:sz w:val="32"/>
-                  <w:szCs w:val="32"/>
-                </w:rPr>
-                <w:t>Ehatisham</w:t>
-              </w:r>
-              <w:proofErr w:type="spellEnd"/>
-              <w:r>
-                <w:rPr>
-                  <w:rFonts w:ascii="TH SarabunPSK" w:hAnsi="TH SarabunPSK" w:cs="TH SarabunPSK"/>
-                  <w:sz w:val="32"/>
-                  <w:szCs w:val="32"/>
-                </w:rPr>
-                <w:t xml:space="preserve">-ul-Haq, M. (2019). A comprehensive survey on fall detection systems: Approaches, datasets, and challenges. </w:t>
-              </w:r>
-              <w:r>
-                <w:rPr>
-                  <w:rFonts w:ascii="TH SarabunPSK" w:hAnsi="TH SarabunPSK" w:cs="TH SarabunPSK"/>
-                  <w:i/>
-                  <w:iCs/>
-                  <w:sz w:val="32"/>
-                  <w:szCs w:val="32"/>
-                </w:rPr>
-                <w:t>IEEE Access</w:t>
-              </w:r>
-              <w:r>
-                <w:rPr>
-                  <w:rFonts w:ascii="TH SarabunPSK" w:hAnsi="TH SarabunPSK" w:cs="TH SarabunPSK"/>
-                  <w:sz w:val="32"/>
-                  <w:szCs w:val="32"/>
-                </w:rPr>
-                <w:t xml:space="preserve">, </w:t>
-              </w:r>
-              <w:r>
-                <w:rPr>
-                  <w:rFonts w:ascii="TH SarabunPSK" w:hAnsi="TH SarabunPSK" w:cs="TH SarabunPSK"/>
-                  <w:i/>
-                  <w:iCs/>
-                  <w:sz w:val="32"/>
-                  <w:szCs w:val="32"/>
-                </w:rPr>
-                <w:t>7</w:t>
-              </w:r>
-              <w:r>
-                <w:rPr>
-                  <w:rFonts w:ascii="TH SarabunPSK" w:hAnsi="TH SarabunPSK" w:cs="TH SarabunPSK"/>
-                  <w:sz w:val="32"/>
-                  <w:szCs w:val="32"/>
-                </w:rPr>
-                <w:t xml:space="preserve">, 63784-63806. </w:t>
-              </w:r>
-              <w:hyperlink r:id="rId15" w:history="1">
-                <w:r>
-                  <w:rPr>
-                    <w:rStyle w:val="a7"/>
-                    <w:rFonts w:ascii="TH SarabunPSK" w:hAnsi="TH SarabunPSK" w:cs="TH SarabunPSK"/>
-                    <w:sz w:val="32"/>
-                    <w:szCs w:val="32"/>
-                  </w:rPr>
-                  <w:t>https://doi.org/10.1109/ACCESS.2019.2917711</w:t>
-                </w:r>
-              </w:hyperlink>
-            </w:p>
-            <w:p>
-              <w:pPr>
-                <w:pStyle w:val="a9"/>
-                <w:ind w:left="720" w:hanging="720"/>
-                <w:rPr>
-                  <w:rFonts w:ascii="TH SarabunPSK" w:hAnsi="TH SarabunPSK" w:cs="TH SarabunPSK"/>
-                  <w:sz w:val="32"/>
-                  <w:szCs w:val="32"/>
-                </w:rPr>
-              </w:pPr>
-            </w:p>
-          </w:sdtContent>
-        </w:sdt>
-      </w:sdtContent>
-    </w:sdt>
     <w:p>
       <w:pPr>
         <w:pStyle w:val="1"/>
@@ -768,7 +10,6 @@
         <w:rPr>
           <w:sz w:val="32"/>
           <w:szCs w:val="32"/>
-          <w:cs w:val="0"/>
           <w:lang w:val="th-TH"/>
         </w:rPr>
       </w:pPr>
@@ -778,22 +19,12 @@
           <w:szCs w:val="32"/>
           <w:lang w:val="th-TH"/>
         </w:rPr>
-        <w:lastRenderedPageBreak/>
         <w:t>บรรณานุกรม</w:t>
-      </w:r>
-      <w:r>
-        <w:rPr>
-          <w:sz w:val="32"/>
-          <w:szCs w:val="32"/>
-          <w:lang w:val="th-TH"/>
-        </w:rPr>
-        <w:t>(ต่อ)</w:t>
       </w:r>
     </w:p>
     <w:p>
       <w:pPr>
         <w:rPr>
-          <w:rFonts w:hint="cs"/>
           <w:lang w:val="th-TH"/>
         </w:rPr>
       </w:pPr>
@@ -801,105 +32,182 @@
     <w:p>
       <w:pPr>
         <w:pStyle w:val="a9"/>
-        <w:ind w:left="720" w:hanging="720"/>
-        <w:rPr>
-          <w:rFonts w:ascii="TH SarabunPSK" w:hAnsi="TH SarabunPSK" w:cs="TH SarabunPSK"/>
-          <w:sz w:val="32"/>
-          <w:szCs w:val="32"/>
-        </w:rPr>
+        <w:spacing w:after="80"/>
+        <w:ind w:left="709" w:hanging="709"/>
+        <w:jc w:val="thaiDistribute"/>
       </w:pPr>
+      <w:r>
+        <w:rPr>
+          <w:rFonts w:ascii="TH SarabunPSK" w:hAnsi="TH SarabunPSK" w:cs="TH SarabunPSK"/>
+          <w:sz w:val="32"/>
+        </w:rPr>
+        <w:t>[1]</w:t>
+      </w:r>
+      <w:r>
+        <w:rPr>
+          <w:rFonts w:ascii="TH SarabunPSK" w:hAnsi="TH SarabunPSK" w:cs="TH SarabunPSK"/>
+          <w:sz w:val="32"/>
+        </w:rPr>
+        <w:t xml:space="preserve"> </w:t>
+      </w:r>
+      <w:r>
+        <w:rPr>
+          <w:rFonts w:ascii="TH SarabunPSK" w:hAnsi="TH SarabunPSK" w:cs="TH SarabunPSK"/>
+          <w:sz w:val="32"/>
+        </w:rPr>
+        <w:t>World Health Organization</w:t>
+      </w:r>
+      <w:r>
+        <w:rPr>
+          <w:rFonts w:ascii="TH SarabunPSK" w:hAnsi="TH SarabunPSK" w:cs="TH SarabunPSK"/>
+          <w:sz w:val="32"/>
+        </w:rPr>
+        <w:t>(2021)</w:t>
+      </w:r>
+      <w:r>
+        <w:rPr>
+          <w:rFonts w:ascii="TH SarabunPSK" w:hAnsi="TH SarabunPSK" w:cs="TH SarabunPSK"/>
+          <w:sz w:val="32"/>
+        </w:rPr>
+        <w:t>, "Falls,"</w:t>
+      </w:r>
+      <w:r>
+        <w:rPr>
+          <w:rFonts w:ascii="TH SarabunPSK" w:hAnsi="TH SarabunPSK" w:cs="TH SarabunPSK"/>
+          <w:sz w:val="32"/>
+        </w:rPr>
+        <w:t xml:space="preserve"> </w:t>
+      </w:r>
+      <w:r>
+        <w:rPr>
+          <w:rFonts w:ascii="TH SarabunPSK" w:hAnsi="TH SarabunPSK" w:cs="TH SarabunPSK"/>
+          <w:sz w:val="32"/>
+        </w:rPr>
+        <w:t>[Online].</w:t>
+      </w:r>
       <w:proofErr w:type="spellStart"/>
       <w:r>
         <w:rPr>
           <w:rFonts w:ascii="TH SarabunPSK" w:hAnsi="TH SarabunPSK" w:cs="TH SarabunPSK"/>
           <w:sz w:val="32"/>
-          <w:szCs w:val="32"/>
-        </w:rPr>
-        <w:t>InvenSense</w:t>
+        </w:rPr>
+        <w:t>Available:https</w:t>
       </w:r>
       <w:proofErr w:type="spellEnd"/>
       <w:r>
         <w:rPr>
           <w:rFonts w:ascii="TH SarabunPSK" w:hAnsi="TH SarabunPSK" w:cs="TH SarabunPSK"/>
           <w:sz w:val="32"/>
-          <w:szCs w:val="32"/>
-        </w:rPr>
-        <w:t xml:space="preserve"> Inc. (2013). </w:t>
-      </w:r>
-      <w:r>
-        <w:rPr>
-          <w:rFonts w:ascii="TH SarabunPSK" w:hAnsi="TH SarabunPSK" w:cs="TH SarabunPSK"/>
-          <w:i/>
-          <w:iCs/>
-          <w:sz w:val="32"/>
-          <w:szCs w:val="32"/>
-        </w:rPr>
-        <w:t>MPU-6000 and MPU-6050 product specification</w:t>
-      </w:r>
-      <w:r>
-        <w:rPr>
-          <w:rFonts w:ascii="TH SarabunPSK" w:hAnsi="TH SarabunPSK" w:cs="TH SarabunPSK"/>
-          <w:sz w:val="32"/>
-          <w:szCs w:val="32"/>
-        </w:rPr>
-        <w:t xml:space="preserve"> (Revision 3.4). </w:t>
-      </w:r>
-      <w:proofErr w:type="spellStart"/>
-      <w:r>
-        <w:rPr>
-          <w:rFonts w:ascii="TH SarabunPSK" w:hAnsi="TH SarabunPSK" w:cs="TH SarabunPSK"/>
-          <w:sz w:val="32"/>
-          <w:szCs w:val="32"/>
-        </w:rPr>
-        <w:t>InvenSense</w:t>
-      </w:r>
-      <w:proofErr w:type="spellEnd"/>
-      <w:r>
-        <w:rPr>
-          <w:rFonts w:ascii="TH SarabunPSK" w:hAnsi="TH SarabunPSK" w:cs="TH SarabunPSK"/>
-          <w:sz w:val="32"/>
-          <w:szCs w:val="32"/>
-        </w:rPr>
-        <w:t xml:space="preserve"> Inc. </w:t>
-      </w:r>
-      <w:hyperlink r:id="rId16" w:history="1">
-        <w:r>
-          <w:rPr>
-            <w:rStyle w:val="a7"/>
-            <w:rFonts w:ascii="TH SarabunPSK" w:hAnsi="TH SarabunPSK" w:cs="TH SarabunPSK"/>
-            <w:sz w:val="32"/>
-            <w:szCs w:val="32"/>
-          </w:rPr>
-          <w:t>https://invensense.tdk.com/wp-content/uploads/2015/02/MPU-6000-Datasheet1.pdf</w:t>
-        </w:r>
-      </w:hyperlink>
+        </w:rPr>
+        <w:t>://www.who.int</w:t>
+      </w:r>
+      <w:r>
+        <w:rPr>
+          <w:rFonts w:ascii="TH SarabunPSK" w:hAnsi="TH SarabunPSK" w:cs="TH SarabunPSK"/>
+          <w:sz w:val="32"/>
+        </w:rPr>
+        <w:br/>
+      </w:r>
+      <w:r>
+        <w:rPr>
+          <w:rFonts w:ascii="TH SarabunPSK" w:hAnsi="TH SarabunPSK" w:cs="TH SarabunPSK"/>
+          <w:sz w:val="32"/>
+        </w:rPr>
+        <w:t>/news-room/fact-sheets/detail/falls</w:t>
+      </w:r>
+      <w:r>
+        <w:t>.</w:t>
+      </w:r>
+      <w:r>
+        <w:rPr>
+          <w:rFonts w:ascii="TH SarabunPSK" w:hAnsi="TH SarabunPSK" w:cs="TH SarabunPSK"/>
+          <w:sz w:val="32"/>
+          <w:szCs w:val="32"/>
+        </w:rPr>
+        <w:t xml:space="preserve">[Accessed 7 </w:t>
+      </w:r>
+      <w:r>
+        <w:rPr>
+          <w:rFonts w:ascii="TH SarabunPSK" w:hAnsi="TH SarabunPSK" w:cs="TH SarabunPSK"/>
+          <w:sz w:val="32"/>
+          <w:szCs w:val="32"/>
+          <w:cs/>
+        </w:rPr>
+        <w:t>มิถุนายน 2569</w:t>
+      </w:r>
+      <w:r>
+        <w:rPr>
+          <w:rFonts w:ascii="TH SarabunPSK" w:hAnsi="TH SarabunPSK" w:cs="TH SarabunPSK"/>
+          <w:sz w:val="32"/>
+          <w:szCs w:val="32"/>
+        </w:rPr>
+        <w:t>]</w:t>
+      </w:r>
     </w:p>
     <w:p>
       <w:pPr>
         <w:pStyle w:val="a9"/>
-        <w:ind w:left="720" w:hanging="720"/>
-        <w:rPr>
-          <w:rFonts w:ascii="TH SarabunPSK" w:hAnsi="TH SarabunPSK" w:cs="TH SarabunPSK"/>
-          <w:sz w:val="32"/>
-          <w:szCs w:val="32"/>
-        </w:rPr>
+        <w:spacing w:after="80"/>
+        <w:ind w:left="709" w:hanging="709"/>
+        <w:jc w:val="thaiDistribute"/>
       </w:pPr>
       <w:r>
         <w:rPr>
           <w:rFonts w:ascii="TH SarabunPSK" w:hAnsi="TH SarabunPSK" w:cs="TH SarabunPSK"/>
           <w:sz w:val="32"/>
-          <w:szCs w:val="32"/>
-        </w:rPr>
-        <w:t xml:space="preserve">Pedregosa, F., </w:t>
+        </w:rPr>
+        <w:t>[2]</w:t>
+      </w:r>
+      <w:r>
+        <w:rPr>
+          <w:rFonts w:ascii="TH SarabunPSK" w:hAnsi="TH SarabunPSK" w:cs="TH SarabunPSK"/>
+          <w:sz w:val="32"/>
+        </w:rPr>
+        <w:t xml:space="preserve"> </w:t>
+      </w:r>
+      <w:r>
+        <w:rPr>
+          <w:rFonts w:ascii="TH SarabunPSK" w:hAnsi="TH SarabunPSK" w:cs="TH SarabunPSK"/>
+          <w:sz w:val="32"/>
+        </w:rPr>
+        <w:t>C. R. Warden</w:t>
+      </w:r>
+      <w:r>
+        <w:rPr>
+          <w:rFonts w:ascii="TH SarabunPSK" w:hAnsi="TH SarabunPSK" w:cs="TH SarabunPSK"/>
+          <w:sz w:val="32"/>
+        </w:rPr>
+        <w:t>(2007)</w:t>
+      </w:r>
+      <w:r>
+        <w:rPr>
+          <w:rFonts w:ascii="TH SarabunPSK" w:hAnsi="TH SarabunPSK" w:cs="TH SarabunPSK"/>
+          <w:sz w:val="32"/>
+        </w:rPr>
+        <w:t>, "Elderly falls: Review of risk factors, detection, and prevention strategies,"</w:t>
+      </w:r>
+      <w:r>
+        <w:rPr>
+          <w:rFonts w:ascii="TH SarabunPSK" w:hAnsi="TH SarabunPSK" w:cs="TH SarabunPSK"/>
+          <w:sz w:val="32"/>
+        </w:rPr>
+        <w:t xml:space="preserve"> [Online].</w:t>
       </w:r>
       <w:proofErr w:type="spellStart"/>
       <w:r>
         <w:rPr>
           <w:rFonts w:ascii="TH SarabunPSK" w:hAnsi="TH SarabunPSK" w:cs="TH SarabunPSK"/>
           <w:sz w:val="32"/>
-          <w:szCs w:val="32"/>
-        </w:rPr>
-        <w:t>Varoquaux</w:t>
+        </w:rPr>
+        <w:t>Available:</w:t>
+      </w:r>
+      <w:r>
+        <w:rPr>
+          <w:rFonts w:ascii="TH SarabunPSK" w:hAnsi="TH SarabunPSK" w:cs="TH SarabunPSK"/>
+          <w:sz w:val="32"/>
+          <w:szCs w:val="32"/>
+        </w:rPr>
+        <w:t>https</w:t>
       </w:r>
       <w:proofErr w:type="spellEnd"/>
       <w:r>
@@ -908,126 +216,76 @@
           <w:sz w:val="32"/>
           <w:szCs w:val="32"/>
         </w:rPr>
-        <w:t xml:space="preserve">, G., </w:t>
-      </w:r>
-      <w:proofErr w:type="spellStart"/>
-      <w:r>
-        <w:rPr>
-          <w:rFonts w:ascii="TH SarabunPSK" w:hAnsi="TH SarabunPSK" w:cs="TH SarabunPSK"/>
-          <w:sz w:val="32"/>
-          <w:szCs w:val="32"/>
-        </w:rPr>
-        <w:t>Gramfort</w:t>
-      </w:r>
-      <w:proofErr w:type="spellEnd"/>
-      <w:r>
-        <w:rPr>
-          <w:rFonts w:ascii="TH SarabunPSK" w:hAnsi="TH SarabunPSK" w:cs="TH SarabunPSK"/>
-          <w:sz w:val="32"/>
-          <w:szCs w:val="32"/>
-        </w:rPr>
-        <w:t xml:space="preserve">, A., Michel, V., Thirion, B., Grisel, O., Blondel, M., </w:t>
-      </w:r>
-      <w:proofErr w:type="spellStart"/>
-      <w:r>
-        <w:rPr>
-          <w:rFonts w:ascii="TH SarabunPSK" w:hAnsi="TH SarabunPSK" w:cs="TH SarabunPSK"/>
-          <w:sz w:val="32"/>
-          <w:szCs w:val="32"/>
-        </w:rPr>
-        <w:t>Prettenhofer</w:t>
-      </w:r>
-      <w:proofErr w:type="spellEnd"/>
-      <w:r>
-        <w:rPr>
-          <w:rFonts w:ascii="TH SarabunPSK" w:hAnsi="TH SarabunPSK" w:cs="TH SarabunPSK"/>
-          <w:sz w:val="32"/>
-          <w:szCs w:val="32"/>
-        </w:rPr>
-        <w:t xml:space="preserve">, P., Weiss, R., Dubourg, V., Vanderplas, J., Passos, A., </w:t>
-      </w:r>
-      <w:proofErr w:type="spellStart"/>
-      <w:r>
-        <w:rPr>
-          <w:rFonts w:ascii="TH SarabunPSK" w:hAnsi="TH SarabunPSK" w:cs="TH SarabunPSK"/>
-          <w:sz w:val="32"/>
-          <w:szCs w:val="32"/>
-        </w:rPr>
-        <w:t>Cournapeau</w:t>
-      </w:r>
-      <w:proofErr w:type="spellEnd"/>
-      <w:r>
-        <w:rPr>
-          <w:rFonts w:ascii="TH SarabunPSK" w:hAnsi="TH SarabunPSK" w:cs="TH SarabunPSK"/>
-          <w:sz w:val="32"/>
-          <w:szCs w:val="32"/>
-        </w:rPr>
-        <w:t xml:space="preserve">, D., Brucher, M., Perrot, M., &amp; Duchesnay, É. (2011). Scikit-learn: Machine learning in Python. </w:t>
-      </w:r>
-      <w:r>
-        <w:rPr>
-          <w:rFonts w:ascii="TH SarabunPSK" w:hAnsi="TH SarabunPSK" w:cs="TH SarabunPSK"/>
-          <w:i/>
-          <w:iCs/>
-          <w:sz w:val="32"/>
-          <w:szCs w:val="32"/>
-        </w:rPr>
-        <w:t>Journal of Machine Learning Research</w:t>
-      </w:r>
-      <w:r>
-        <w:rPr>
-          <w:rFonts w:ascii="TH SarabunPSK" w:hAnsi="TH SarabunPSK" w:cs="TH SarabunPSK"/>
-          <w:sz w:val="32"/>
-          <w:szCs w:val="32"/>
-        </w:rPr>
-        <w:t xml:space="preserve">, </w:t>
-      </w:r>
-      <w:r>
-        <w:rPr>
-          <w:rFonts w:ascii="TH SarabunPSK" w:hAnsi="TH SarabunPSK" w:cs="TH SarabunPSK"/>
-          <w:i/>
-          <w:iCs/>
-          <w:sz w:val="32"/>
-          <w:szCs w:val="32"/>
-        </w:rPr>
-        <w:t>12</w:t>
-      </w:r>
-      <w:r>
-        <w:rPr>
-          <w:rFonts w:ascii="TH SarabunPSK" w:hAnsi="TH SarabunPSK" w:cs="TH SarabunPSK"/>
-          <w:sz w:val="32"/>
-          <w:szCs w:val="32"/>
-        </w:rPr>
-        <w:t xml:space="preserve">, 2825-2830. </w:t>
-      </w:r>
-      <w:hyperlink r:id="rId17" w:history="1">
-        <w:r>
-          <w:rPr>
-            <w:rStyle w:val="a7"/>
-            <w:rFonts w:ascii="TH SarabunPSK" w:hAnsi="TH SarabunPSK" w:cs="TH SarabunPSK"/>
-            <w:sz w:val="32"/>
-            <w:szCs w:val="32"/>
-          </w:rPr>
-          <w:t>https://jmlr.org/papers/v12/pedregosa11a.html</w:t>
-        </w:r>
-      </w:hyperlink>
+        <w:t>://www.tandfonline.com/doi/pdf/10.1080/1</w:t>
+      </w:r>
+      <w:r>
+        <w:rPr>
+          <w:rFonts w:ascii="TH SarabunPSK" w:hAnsi="TH SarabunPSK" w:cs="TH SarabunPSK"/>
+          <w:sz w:val="32"/>
+          <w:szCs w:val="32"/>
+        </w:rPr>
+        <w:br/>
+        <w:t xml:space="preserve">0903127.2025.2541258 </w:t>
+      </w:r>
+      <w:r>
+        <w:rPr>
+          <w:rFonts w:ascii="TH SarabunPSK" w:hAnsi="TH SarabunPSK" w:cs="TH SarabunPSK"/>
+          <w:sz w:val="32"/>
+          <w:szCs w:val="32"/>
+        </w:rPr>
+        <w:t xml:space="preserve">[Accessed 7 </w:t>
+      </w:r>
+      <w:r>
+        <w:rPr>
+          <w:rFonts w:ascii="TH SarabunPSK" w:hAnsi="TH SarabunPSK" w:cs="TH SarabunPSK"/>
+          <w:sz w:val="32"/>
+          <w:szCs w:val="32"/>
+          <w:cs/>
+        </w:rPr>
+        <w:t>มิถุนายน 2569</w:t>
+      </w:r>
+      <w:r>
+        <w:rPr>
+          <w:rFonts w:ascii="TH SarabunPSK" w:hAnsi="TH SarabunPSK" w:cs="TH SarabunPSK"/>
+          <w:sz w:val="32"/>
+          <w:szCs w:val="32"/>
+        </w:rPr>
+        <w:t>]</w:t>
+      </w:r>
     </w:p>
     <w:p>
       <w:pPr>
         <w:pStyle w:val="a9"/>
-        <w:ind w:left="720" w:hanging="720"/>
-        <w:rPr>
-          <w:rFonts w:ascii="TH SarabunPSK" w:hAnsi="TH SarabunPSK" w:cs="TH SarabunPSK"/>
-          <w:sz w:val="32"/>
-          <w:szCs w:val="32"/>
-        </w:rPr>
+        <w:spacing w:after="80"/>
+        <w:ind w:left="709" w:hanging="709"/>
+        <w:jc w:val="thaiDistribute"/>
       </w:pPr>
+      <w:r>
+        <w:rPr>
+          <w:rFonts w:ascii="TH SarabunPSK" w:hAnsi="TH SarabunPSK" w:cs="TH SarabunPSK"/>
+          <w:sz w:val="32"/>
+        </w:rPr>
+        <w:t>[3]</w:t>
+      </w:r>
+      <w:r>
+        <w:rPr>
+          <w:rFonts w:ascii="TH SarabunPSK" w:hAnsi="TH SarabunPSK" w:cs="TH SarabunPSK"/>
+          <w:sz w:val="32"/>
+        </w:rPr>
+        <w:t xml:space="preserve"> </w:t>
+      </w:r>
+      <w:r>
+        <w:rPr>
+          <w:rFonts w:ascii="TH SarabunPSK" w:hAnsi="TH SarabunPSK" w:cs="TH SarabunPSK"/>
+          <w:sz w:val="32"/>
+        </w:rPr>
+        <w:t xml:space="preserve">F. </w:t>
+      </w:r>
       <w:proofErr w:type="spellStart"/>
       <w:r>
         <w:rPr>
           <w:rFonts w:ascii="TH SarabunPSK" w:hAnsi="TH SarabunPSK" w:cs="TH SarabunPSK"/>
           <w:sz w:val="32"/>
-          <w:szCs w:val="32"/>
         </w:rPr>
         <w:t>Sposaro</w:t>
       </w:r>
@@ -1036,16 +294,28 @@
         <w:rPr>
           <w:rFonts w:ascii="TH SarabunPSK" w:hAnsi="TH SarabunPSK" w:cs="TH SarabunPSK"/>
           <w:sz w:val="32"/>
-          <w:szCs w:val="32"/>
-        </w:rPr>
-        <w:t xml:space="preserve">, S., &amp; Tyson, G. (2009). </w:t>
+        </w:rPr>
+        <w:t xml:space="preserve"> and G. Tyson</w:t>
+      </w:r>
+      <w:r>
+        <w:rPr>
+          <w:rFonts w:ascii="TH SarabunPSK" w:hAnsi="TH SarabunPSK" w:cs="TH SarabunPSK"/>
+          <w:sz w:val="32"/>
+        </w:rPr>
+        <w:t>(2009)</w:t>
+      </w:r>
+      <w:r>
+        <w:rPr>
+          <w:rFonts w:ascii="TH SarabunPSK" w:hAnsi="TH SarabunPSK" w:cs="TH SarabunPSK"/>
+          <w:sz w:val="32"/>
+        </w:rPr>
+        <w:t>, "</w:t>
       </w:r>
       <w:proofErr w:type="spellStart"/>
       <w:r>
         <w:rPr>
           <w:rFonts w:ascii="TH SarabunPSK" w:hAnsi="TH SarabunPSK" w:cs="TH SarabunPSK"/>
           <w:sz w:val="32"/>
-          <w:szCs w:val="32"/>
         </w:rPr>
         <w:t>iFall</w:t>
       </w:r>
@@ -1054,56 +324,67 @@
         <w:rPr>
           <w:rFonts w:ascii="TH SarabunPSK" w:hAnsi="TH SarabunPSK" w:cs="TH SarabunPSK"/>
           <w:sz w:val="32"/>
-          <w:szCs w:val="32"/>
-        </w:rPr>
-        <w:t xml:space="preserve">: An Android application for fall detection and response. In </w:t>
-      </w:r>
-      <w:r>
-        <w:rPr>
-          <w:rFonts w:ascii="TH SarabunPSK" w:hAnsi="TH SarabunPSK" w:cs="TH SarabunPSK"/>
-          <w:i/>
-          <w:iCs/>
-          <w:sz w:val="32"/>
-          <w:szCs w:val="32"/>
-        </w:rPr>
-        <w:t>Proceedings of the 31st Annual International Conference of the IEEE Engineering in Medicine and Biology Society (EMBC 2009)</w:t>
-      </w:r>
-      <w:r>
-        <w:rPr>
-          <w:rFonts w:ascii="TH SarabunPSK" w:hAnsi="TH SarabunPSK" w:cs="TH SarabunPSK"/>
-          <w:sz w:val="32"/>
-          <w:szCs w:val="32"/>
-        </w:rPr>
-        <w:t xml:space="preserve"> (pp. 6119-6122). IEEE. </w:t>
-      </w:r>
-      <w:hyperlink r:id="rId18" w:history="1">
-        <w:r>
-          <w:rPr>
-            <w:rStyle w:val="a7"/>
-            <w:rFonts w:ascii="TH SarabunPSK" w:hAnsi="TH SarabunPSK" w:cs="TH SarabunPSK"/>
-            <w:sz w:val="32"/>
-            <w:szCs w:val="32"/>
-          </w:rPr>
-          <w:t>https://doi.org/10.1109/IEMBS.2009.5334912</w:t>
-        </w:r>
-      </w:hyperlink>
+        </w:rPr>
+        <w:t xml:space="preserve">: An Android application for fall detection and response,", </w:t>
+      </w:r>
+      <w:proofErr w:type="spellStart"/>
+      <w:r>
+        <w:rPr>
+          <w:rFonts w:ascii="TH SarabunPSK" w:hAnsi="TH SarabunPSK" w:cs="TH SarabunPSK"/>
+          <w:sz w:val="32"/>
+        </w:rPr>
+        <w:t>doi</w:t>
+      </w:r>
+      <w:proofErr w:type="spellEnd"/>
+      <w:r>
+        <w:rPr>
+          <w:rFonts w:ascii="TH SarabunPSK" w:hAnsi="TH SarabunPSK" w:cs="TH SarabunPSK"/>
+          <w:sz w:val="32"/>
+        </w:rPr>
+        <w:t>: 10.1109/IEMBS.2009.5334912.</w:t>
+      </w:r>
+      <w:r>
+        <w:rPr>
+          <w:rFonts w:ascii="TH SarabunPSK" w:hAnsi="TH SarabunPSK" w:cs="TH SarabunPSK"/>
+          <w:sz w:val="32"/>
+          <w:szCs w:val="32"/>
+        </w:rPr>
+        <w:t xml:space="preserve"> </w:t>
+      </w:r>
     </w:p>
     <w:p>
       <w:pPr>
         <w:pStyle w:val="a9"/>
-        <w:ind w:left="720" w:hanging="720"/>
-        <w:rPr>
-          <w:rFonts w:ascii="TH SarabunPSK" w:hAnsi="TH SarabunPSK" w:cs="TH SarabunPSK"/>
-          <w:sz w:val="32"/>
-          <w:szCs w:val="32"/>
-        </w:rPr>
+        <w:spacing w:after="80"/>
+        <w:ind w:left="709" w:hanging="709"/>
+        <w:jc w:val="thaiDistribute"/>
       </w:pPr>
+      <w:r>
+        <w:rPr>
+          <w:rFonts w:ascii="TH SarabunPSK" w:hAnsi="TH SarabunPSK" w:cs="TH SarabunPSK"/>
+          <w:sz w:val="32"/>
+        </w:rPr>
+        <w:t>[4]</w:t>
+      </w:r>
+      <w:r>
+        <w:rPr>
+          <w:rFonts w:ascii="TH SarabunPSK" w:hAnsi="TH SarabunPSK" w:cs="TH SarabunPSK"/>
+          <w:sz w:val="32"/>
+        </w:rPr>
+        <w:t xml:space="preserve"> </w:t>
+      </w:r>
+      <w:r>
+        <w:rPr>
+          <w:rFonts w:ascii="TH SarabunPSK" w:hAnsi="TH SarabunPSK" w:cs="TH SarabunPSK"/>
+          <w:sz w:val="32"/>
+        </w:rPr>
+        <w:t xml:space="preserve">A. </w:t>
+      </w:r>
       <w:proofErr w:type="spellStart"/>
       <w:r>
         <w:rPr>
           <w:rFonts w:ascii="TH SarabunPSK" w:hAnsi="TH SarabunPSK" w:cs="TH SarabunPSK"/>
           <w:sz w:val="32"/>
-          <w:szCs w:val="32"/>
         </w:rPr>
         <w:t>Sucerquia</w:t>
       </w:r>
@@ -1112,16 +393,14 @@
         <w:rPr>
           <w:rFonts w:ascii="TH SarabunPSK" w:hAnsi="TH SarabunPSK" w:cs="TH SarabunPSK"/>
           <w:sz w:val="32"/>
-          <w:szCs w:val="32"/>
-        </w:rPr>
-        <w:t xml:space="preserve">, A., López, J. D., &amp; Vargas-Bonilla, J. F. (2017). </w:t>
+        </w:rPr>
+        <w:t>, J.D. López, and J.F. Vargas-Bonilla, "</w:t>
       </w:r>
       <w:proofErr w:type="spellStart"/>
       <w:r>
         <w:rPr>
           <w:rFonts w:ascii="TH SarabunPSK" w:hAnsi="TH SarabunPSK" w:cs="TH SarabunPSK"/>
           <w:sz w:val="32"/>
-          <w:szCs w:val="32"/>
         </w:rPr>
         <w:t>SisFall</w:t>
       </w:r>
@@ -1130,182 +409,1240 @@
         <w:rPr>
           <w:rFonts w:ascii="TH SarabunPSK" w:hAnsi="TH SarabunPSK" w:cs="TH SarabunPSK"/>
           <w:sz w:val="32"/>
-          <w:szCs w:val="32"/>
-        </w:rPr>
-        <w:t xml:space="preserve">: A fall and movement dataset. </w:t>
-      </w:r>
-      <w:r>
-        <w:rPr>
-          <w:rFonts w:ascii="TH SarabunPSK" w:hAnsi="TH SarabunPSK" w:cs="TH SarabunPSK"/>
-          <w:i/>
-          <w:iCs/>
-          <w:sz w:val="32"/>
-          <w:szCs w:val="32"/>
-        </w:rPr>
-        <w:t>Sensors</w:t>
-      </w:r>
-      <w:r>
-        <w:rPr>
-          <w:rFonts w:ascii="TH SarabunPSK" w:hAnsi="TH SarabunPSK" w:cs="TH SarabunPSK"/>
-          <w:sz w:val="32"/>
-          <w:szCs w:val="32"/>
-        </w:rPr>
-        <w:t xml:space="preserve">, </w:t>
-      </w:r>
-      <w:r>
-        <w:rPr>
-          <w:rFonts w:ascii="TH SarabunPSK" w:hAnsi="TH SarabunPSK" w:cs="TH SarabunPSK"/>
-          <w:i/>
-          <w:iCs/>
-          <w:sz w:val="32"/>
-          <w:szCs w:val="32"/>
-        </w:rPr>
-        <w:t>17</w:t>
-      </w:r>
-      <w:r>
-        <w:rPr>
-          <w:rFonts w:ascii="TH SarabunPSK" w:hAnsi="TH SarabunPSK" w:cs="TH SarabunPSK"/>
-          <w:sz w:val="32"/>
-          <w:szCs w:val="32"/>
-        </w:rPr>
-        <w:t xml:space="preserve">(1), Article 198. </w:t>
-      </w:r>
-      <w:hyperlink r:id="rId19" w:history="1">
-        <w:r>
-          <w:rPr>
-            <w:rStyle w:val="a7"/>
-            <w:rFonts w:ascii="TH SarabunPSK" w:hAnsi="TH SarabunPSK" w:cs="TH SarabunPSK"/>
-            <w:sz w:val="32"/>
-            <w:szCs w:val="32"/>
-          </w:rPr>
-          <w:t>https://doi.org/10.3390/s17010198</w:t>
-        </w:r>
-      </w:hyperlink>
+        </w:rPr>
+        <w:t xml:space="preserve">: A fall and movement dataset," </w:t>
+      </w:r>
+      <w:r>
+        <w:rPr>
+          <w:rFonts w:ascii="TH SarabunPSK" w:hAnsi="TH SarabunPSK" w:cs="TH SarabunPSK"/>
+          <w:sz w:val="32"/>
+        </w:rPr>
+        <w:t>[Online].</w:t>
+      </w:r>
+      <w:proofErr w:type="spellStart"/>
+      <w:r>
+        <w:rPr>
+          <w:rFonts w:ascii="TH SarabunPSK" w:hAnsi="TH SarabunPSK" w:cs="TH SarabunPSK"/>
+          <w:sz w:val="32"/>
+        </w:rPr>
+        <w:t>Available:</w:t>
+      </w:r>
+      <w:r>
+        <w:rPr>
+          <w:rFonts w:ascii="TH SarabunPSK" w:hAnsi="TH SarabunPSK" w:cs="TH SarabunPSK"/>
+          <w:sz w:val="32"/>
+          <w:szCs w:val="32"/>
+        </w:rPr>
+        <w:t>https</w:t>
+      </w:r>
+      <w:proofErr w:type="spellEnd"/>
+      <w:r>
+        <w:rPr>
+          <w:rFonts w:ascii="TH SarabunPSK" w:hAnsi="TH SarabunPSK" w:cs="TH SarabunPSK"/>
+          <w:sz w:val="32"/>
+          <w:szCs w:val="32"/>
+        </w:rPr>
+        <w:t xml:space="preserve">://pubmed.ncbi.nlm.nih.gov/28117691/ </w:t>
+      </w:r>
+      <w:r>
+        <w:rPr>
+          <w:rFonts w:ascii="TH SarabunPSK" w:hAnsi="TH SarabunPSK" w:cs="TH SarabunPSK"/>
+          <w:sz w:val="32"/>
+          <w:szCs w:val="32"/>
+        </w:rPr>
+        <w:t xml:space="preserve">[Accessed 7 </w:t>
+      </w:r>
+      <w:r>
+        <w:rPr>
+          <w:rFonts w:ascii="TH SarabunPSK" w:hAnsi="TH SarabunPSK" w:cs="TH SarabunPSK"/>
+          <w:sz w:val="32"/>
+          <w:szCs w:val="32"/>
+          <w:cs/>
+        </w:rPr>
+        <w:t>มิถุนายน 2569</w:t>
+      </w:r>
+      <w:r>
+        <w:rPr>
+          <w:rFonts w:ascii="TH SarabunPSK" w:hAnsi="TH SarabunPSK" w:cs="TH SarabunPSK"/>
+          <w:sz w:val="32"/>
+          <w:szCs w:val="32"/>
+        </w:rPr>
+        <w:t>]</w:t>
+      </w:r>
     </w:p>
     <w:p>
       <w:pPr>
         <w:pStyle w:val="a9"/>
-        <w:ind w:left="720" w:hanging="720"/>
-        <w:rPr>
-          <w:rFonts w:ascii="TH SarabunPSK" w:hAnsi="TH SarabunPSK" w:cs="TH SarabunPSK"/>
-          <w:sz w:val="32"/>
-          <w:szCs w:val="32"/>
+        <w:spacing w:after="80"/>
+        <w:ind w:left="709" w:hanging="709"/>
+        <w:jc w:val="thaiDistribute"/>
+        <w:rPr>
+          <w:rFonts w:ascii="TH SarabunPSK" w:hAnsi="TH SarabunPSK" w:cs="TH SarabunPSK"/>
+          <w:sz w:val="32"/>
         </w:rPr>
       </w:pPr>
       <w:r>
         <w:rPr>
           <w:rFonts w:ascii="TH SarabunPSK" w:hAnsi="TH SarabunPSK" w:cs="TH SarabunPSK"/>
           <w:sz w:val="32"/>
-          <w:szCs w:val="32"/>
-        </w:rPr>
-        <w:t xml:space="preserve">Warden, C. R. (2007). Elderly falls: Review of risk factors, detection, and prevention strategies. </w:t>
-      </w:r>
-      <w:r>
-        <w:rPr>
-          <w:rFonts w:ascii="TH SarabunPSK" w:hAnsi="TH SarabunPSK" w:cs="TH SarabunPSK"/>
-          <w:i/>
-          <w:iCs/>
-          <w:sz w:val="32"/>
-          <w:szCs w:val="32"/>
-        </w:rPr>
-        <w:t>Prehospital Emergency Care</w:t>
-      </w:r>
-      <w:r>
-        <w:rPr>
-          <w:rFonts w:ascii="TH SarabunPSK" w:hAnsi="TH SarabunPSK" w:cs="TH SarabunPSK"/>
-          <w:sz w:val="32"/>
-          <w:szCs w:val="32"/>
-        </w:rPr>
-        <w:t xml:space="preserve">, </w:t>
-      </w:r>
-      <w:r>
-        <w:rPr>
-          <w:rFonts w:ascii="TH SarabunPSK" w:hAnsi="TH SarabunPSK" w:cs="TH SarabunPSK"/>
-          <w:i/>
-          <w:iCs/>
-          <w:sz w:val="32"/>
-          <w:szCs w:val="32"/>
-        </w:rPr>
-        <w:t>11</w:t>
-      </w:r>
-      <w:r>
-        <w:rPr>
-          <w:rFonts w:ascii="TH SarabunPSK" w:hAnsi="TH SarabunPSK" w:cs="TH SarabunPSK"/>
-          <w:sz w:val="32"/>
-          <w:szCs w:val="32"/>
-        </w:rPr>
-        <w:t xml:space="preserve">(1), 58-62. </w:t>
-      </w:r>
-      <w:hyperlink r:id="rId20" w:history="1">
-        <w:r>
-          <w:rPr>
-            <w:rStyle w:val="a7"/>
-            <w:rFonts w:ascii="TH SarabunPSK" w:hAnsi="TH SarabunPSK" w:cs="TH SarabunPSK"/>
-            <w:sz w:val="32"/>
-            <w:szCs w:val="32"/>
-          </w:rPr>
-          <w:t>https://doi.org/10.1080/10903120601021037</w:t>
-        </w:r>
-      </w:hyperlink>
+        </w:rPr>
+        <w:t>[5]</w:t>
+      </w:r>
+      <w:r>
+        <w:rPr>
+          <w:rFonts w:ascii="TH SarabunPSK" w:hAnsi="TH SarabunPSK" w:cs="TH SarabunPSK"/>
+          <w:sz w:val="32"/>
+        </w:rPr>
+        <w:t xml:space="preserve"> </w:t>
+      </w:r>
+      <w:proofErr w:type="spellStart"/>
+      <w:r>
+        <w:rPr>
+          <w:rFonts w:ascii="TH SarabunPSK" w:hAnsi="TH SarabunPSK" w:cs="TH SarabunPSK"/>
+          <w:sz w:val="32"/>
+        </w:rPr>
+        <w:t>InvenSense</w:t>
+      </w:r>
+      <w:proofErr w:type="spellEnd"/>
+      <w:r>
+        <w:rPr>
+          <w:rFonts w:ascii="TH SarabunPSK" w:hAnsi="TH SarabunPSK" w:cs="TH SarabunPSK"/>
+          <w:sz w:val="32"/>
+        </w:rPr>
+        <w:t xml:space="preserve"> Inc.</w:t>
+      </w:r>
+      <w:r>
+        <w:rPr>
+          <w:rFonts w:ascii="TH SarabunPSK" w:hAnsi="TH SarabunPSK" w:cs="TH SarabunPSK"/>
+          <w:sz w:val="32"/>
+        </w:rPr>
+        <w:t>(2013)</w:t>
+      </w:r>
+      <w:r>
+        <w:rPr>
+          <w:rFonts w:ascii="TH SarabunPSK" w:hAnsi="TH SarabunPSK" w:cs="TH SarabunPSK"/>
+          <w:sz w:val="32"/>
+        </w:rPr>
+        <w:t xml:space="preserve">, MPU-6000 and MPU-6050 Product Specification, Revision 3.4, [Online]. </w:t>
+      </w:r>
+      <w:proofErr w:type="spellStart"/>
+      <w:r>
+        <w:rPr>
+          <w:rFonts w:ascii="TH SarabunPSK" w:hAnsi="TH SarabunPSK" w:cs="TH SarabunPSK"/>
+          <w:sz w:val="32"/>
+        </w:rPr>
+        <w:t>Available:https</w:t>
+      </w:r>
+      <w:proofErr w:type="spellEnd"/>
+      <w:r>
+        <w:rPr>
+          <w:rFonts w:ascii="TH SarabunPSK" w:hAnsi="TH SarabunPSK" w:cs="TH SarabunPSK"/>
+          <w:sz w:val="32"/>
+        </w:rPr>
+        <w:t>://invensense.tdk.com/wp-content/uploads/2015/02/</w:t>
+      </w:r>
+      <w:r>
+        <w:rPr>
+          <w:rFonts w:ascii="TH SarabunPSK" w:hAnsi="TH SarabunPSK" w:cs="TH SarabunPSK"/>
+          <w:sz w:val="32"/>
+        </w:rPr>
+        <w:br/>
+      </w:r>
+      <w:r>
+        <w:rPr>
+          <w:rFonts w:ascii="TH SarabunPSK" w:hAnsi="TH SarabunPSK" w:cs="TH SarabunPSK"/>
+          <w:sz w:val="32"/>
+        </w:rPr>
+        <w:t>MPU-6000-Datasheet1.pdf</w:t>
+      </w:r>
+      <w:r>
+        <w:rPr>
+          <w:rFonts w:ascii="TH SarabunPSK" w:hAnsi="TH SarabunPSK" w:cs="TH SarabunPSK"/>
+          <w:sz w:val="32"/>
+        </w:rPr>
+        <w:t xml:space="preserve"> </w:t>
+      </w:r>
+      <w:r>
+        <w:rPr>
+          <w:rFonts w:ascii="TH SarabunPSK" w:hAnsi="TH SarabunPSK" w:cs="TH SarabunPSK"/>
+          <w:sz w:val="32"/>
+          <w:szCs w:val="32"/>
+        </w:rPr>
+        <w:t xml:space="preserve">[Accessed 7 </w:t>
+      </w:r>
+      <w:r>
+        <w:rPr>
+          <w:rFonts w:ascii="TH SarabunPSK" w:hAnsi="TH SarabunPSK" w:cs="TH SarabunPSK"/>
+          <w:sz w:val="32"/>
+          <w:szCs w:val="32"/>
+          <w:cs/>
+        </w:rPr>
+        <w:t>มิถุนายน 2569</w:t>
+      </w:r>
+      <w:r>
+        <w:rPr>
+          <w:rFonts w:ascii="TH SarabunPSK" w:hAnsi="TH SarabunPSK" w:cs="TH SarabunPSK"/>
+          <w:sz w:val="32"/>
+          <w:szCs w:val="32"/>
+        </w:rPr>
+        <w:t>]</w:t>
+      </w:r>
     </w:p>
     <w:p>
       <w:pPr>
         <w:pStyle w:val="a9"/>
-        <w:ind w:left="720" w:hanging="720"/>
-        <w:rPr>
-          <w:rFonts w:ascii="TH SarabunPSK" w:hAnsi="TH SarabunPSK" w:cs="TH SarabunPSK"/>
-          <w:sz w:val="32"/>
-          <w:szCs w:val="32"/>
-        </w:rPr>
+        <w:spacing w:after="80"/>
+        <w:ind w:left="709" w:hanging="709"/>
+        <w:jc w:val="thaiDistribute"/>
       </w:pPr>
       <w:r>
         <w:rPr>
           <w:rFonts w:ascii="TH SarabunPSK" w:hAnsi="TH SarabunPSK" w:cs="TH SarabunPSK"/>
           <w:sz w:val="32"/>
-          <w:szCs w:val="32"/>
-        </w:rPr>
-        <w:t xml:space="preserve">World Health Organization. (2021, April 26). </w:t>
-      </w:r>
-      <w:r>
-        <w:rPr>
-          <w:rFonts w:ascii="TH SarabunPSK" w:hAnsi="TH SarabunPSK" w:cs="TH SarabunPSK"/>
-          <w:i/>
-          <w:iCs/>
-          <w:sz w:val="32"/>
-          <w:szCs w:val="32"/>
-        </w:rPr>
-        <w:t>Falls</w:t>
-      </w:r>
-      <w:r>
-        <w:rPr>
-          <w:rFonts w:ascii="TH SarabunPSK" w:hAnsi="TH SarabunPSK" w:cs="TH SarabunPSK"/>
-          <w:sz w:val="32"/>
-          <w:szCs w:val="32"/>
-        </w:rPr>
-        <w:t xml:space="preserve">. World Health Organization. </w:t>
-      </w:r>
-      <w:hyperlink r:id="rId21" w:history="1">
-        <w:r>
-          <w:rPr>
-            <w:rStyle w:val="a7"/>
-            <w:rFonts w:ascii="TH SarabunPSK" w:hAnsi="TH SarabunPSK" w:cs="TH SarabunPSK"/>
-            <w:sz w:val="32"/>
-            <w:szCs w:val="32"/>
-          </w:rPr>
-          <w:t>https://www.who.int/news-room/fact-sheets/detail/falls</w:t>
-        </w:r>
-      </w:hyperlink>
+        </w:rPr>
+        <w:t>[6]</w:t>
+      </w:r>
+      <w:r>
+        <w:rPr>
+          <w:rFonts w:ascii="TH SarabunPSK" w:hAnsi="TH SarabunPSK" w:cs="TH SarabunPSK"/>
+          <w:sz w:val="32"/>
+        </w:rPr>
+        <w:t xml:space="preserve"> </w:t>
+      </w:r>
+      <w:r>
+        <w:rPr>
+          <w:rFonts w:ascii="TH SarabunPSK" w:hAnsi="TH SarabunPSK" w:cs="TH SarabunPSK"/>
+          <w:sz w:val="32"/>
+        </w:rPr>
+        <w:t xml:space="preserve">F. Hussain, F. Hussain, M. </w:t>
+      </w:r>
+      <w:proofErr w:type="spellStart"/>
+      <w:r>
+        <w:rPr>
+          <w:rFonts w:ascii="TH SarabunPSK" w:hAnsi="TH SarabunPSK" w:cs="TH SarabunPSK"/>
+          <w:sz w:val="32"/>
+        </w:rPr>
+        <w:t>Ehatisham</w:t>
+      </w:r>
+      <w:proofErr w:type="spellEnd"/>
+      <w:r>
+        <w:rPr>
+          <w:rFonts w:ascii="TH SarabunPSK" w:hAnsi="TH SarabunPSK" w:cs="TH SarabunPSK"/>
+          <w:sz w:val="32"/>
+        </w:rPr>
+        <w:t>-ul-Haq, and M. A. Azam</w:t>
+      </w:r>
+      <w:r>
+        <w:rPr>
+          <w:rFonts w:ascii="TH SarabunPSK" w:hAnsi="TH SarabunPSK" w:cs="TH SarabunPSK"/>
+          <w:sz w:val="32"/>
+        </w:rPr>
+        <w:t>(2019)</w:t>
+      </w:r>
+      <w:r>
+        <w:rPr>
+          <w:rFonts w:ascii="TH SarabunPSK" w:hAnsi="TH SarabunPSK" w:cs="TH SarabunPSK"/>
+          <w:sz w:val="32"/>
+        </w:rPr>
+        <w:t>, "Activity-aware fall detection and recognition based on wearable sensors,"</w:t>
+      </w:r>
+      <w:r>
+        <w:t xml:space="preserve"> </w:t>
+      </w:r>
+      <w:r>
+        <w:rPr>
+          <w:rFonts w:ascii="TH SarabunPSK" w:hAnsi="TH SarabunPSK" w:cs="TH SarabunPSK"/>
+          <w:sz w:val="32"/>
+        </w:rPr>
+        <w:t>[Online]. Available:</w:t>
+      </w:r>
+      <w:r>
+        <w:rPr>
+          <w:rFonts w:ascii="TH SarabunPSK" w:hAnsi="TH SarabunPSK" w:cs="TH SarabunPSK"/>
+          <w:sz w:val="32"/>
+        </w:rPr>
+        <w:br/>
+        <w:t>https://ieeexplore.ieee.org/document/8641383/</w:t>
+      </w:r>
+      <w:r>
+        <w:t xml:space="preserve"> </w:t>
+      </w:r>
+      <w:r>
+        <w:rPr>
+          <w:rFonts w:ascii="TH SarabunPSK" w:hAnsi="TH SarabunPSK" w:cs="TH SarabunPSK"/>
+          <w:sz w:val="32"/>
+        </w:rPr>
+        <w:t xml:space="preserve"> </w:t>
+      </w:r>
+      <w:r>
+        <w:rPr>
+          <w:rFonts w:ascii="TH SarabunPSK" w:hAnsi="TH SarabunPSK" w:cs="TH SarabunPSK"/>
+          <w:sz w:val="32"/>
+          <w:szCs w:val="32"/>
+        </w:rPr>
+        <w:t xml:space="preserve">[Accessed 7 </w:t>
+      </w:r>
+      <w:r>
+        <w:rPr>
+          <w:rFonts w:ascii="TH SarabunPSK" w:hAnsi="TH SarabunPSK" w:cs="TH SarabunPSK"/>
+          <w:sz w:val="32"/>
+          <w:szCs w:val="32"/>
+          <w:cs/>
+        </w:rPr>
+        <w:t>มิถุนายน 2569</w:t>
+      </w:r>
+      <w:r>
+        <w:rPr>
+          <w:rFonts w:ascii="TH SarabunPSK" w:hAnsi="TH SarabunPSK" w:cs="TH SarabunPSK"/>
+          <w:sz w:val="32"/>
+          <w:szCs w:val="32"/>
+        </w:rPr>
+        <w:t>]</w:t>
+      </w:r>
     </w:p>
     <w:p>
       <w:pPr>
-        <w:spacing w:line="240" w:lineRule="auto"/>
+        <w:pStyle w:val="a9"/>
+        <w:spacing w:after="80"/>
+        <w:ind w:left="709" w:hanging="709"/>
+        <w:jc w:val="thaiDistribute"/>
+      </w:pPr>
+      <w:r>
+        <w:rPr>
+          <w:rFonts w:ascii="TH SarabunPSK" w:hAnsi="TH SarabunPSK" w:cs="TH SarabunPSK"/>
+          <w:sz w:val="32"/>
+        </w:rPr>
+        <w:t>[7]</w:t>
+      </w:r>
+      <w:r>
+        <w:rPr>
+          <w:rFonts w:ascii="TH SarabunPSK" w:hAnsi="TH SarabunPSK" w:cs="TH SarabunPSK"/>
+          <w:sz w:val="32"/>
+        </w:rPr>
+        <w:t xml:space="preserve"> </w:t>
+      </w:r>
+      <w:r>
+        <w:rPr>
+          <w:rFonts w:ascii="TH SarabunPSK" w:hAnsi="TH SarabunPSK" w:cs="TH SarabunPSK"/>
+          <w:sz w:val="32"/>
+        </w:rPr>
+        <w:t xml:space="preserve">L. Angelini, E. </w:t>
+      </w:r>
+      <w:proofErr w:type="spellStart"/>
+      <w:r>
+        <w:rPr>
+          <w:rFonts w:ascii="TH SarabunPSK" w:hAnsi="TH SarabunPSK" w:cs="TH SarabunPSK"/>
+          <w:sz w:val="32"/>
+        </w:rPr>
+        <w:t>Mugellini</w:t>
+      </w:r>
+      <w:proofErr w:type="spellEnd"/>
+      <w:r>
+        <w:rPr>
+          <w:rFonts w:ascii="TH SarabunPSK" w:hAnsi="TH SarabunPSK" w:cs="TH SarabunPSK"/>
+          <w:sz w:val="32"/>
+        </w:rPr>
+        <w:t>, O. A. Khaled, and N. Couture</w:t>
+      </w:r>
+      <w:r>
+        <w:rPr>
+          <w:rFonts w:ascii="TH SarabunPSK" w:hAnsi="TH SarabunPSK" w:cs="TH SarabunPSK"/>
+          <w:sz w:val="32"/>
+        </w:rPr>
+        <w:t>(2022)</w:t>
+      </w:r>
+      <w:r>
+        <w:rPr>
+          <w:rFonts w:ascii="TH SarabunPSK" w:hAnsi="TH SarabunPSK" w:cs="TH SarabunPSK"/>
+          <w:sz w:val="32"/>
+        </w:rPr>
+        <w:t>, "</w:t>
+      </w:r>
+      <w:proofErr w:type="spellStart"/>
+      <w:r>
+        <w:rPr>
+          <w:rFonts w:ascii="TH SarabunPSK" w:hAnsi="TH SarabunPSK" w:cs="TH SarabunPSK"/>
+          <w:sz w:val="32"/>
+        </w:rPr>
+        <w:t>TinyML</w:t>
+      </w:r>
+      <w:proofErr w:type="spellEnd"/>
+      <w:r>
+        <w:rPr>
+          <w:rFonts w:ascii="TH SarabunPSK" w:hAnsi="TH SarabunPSK" w:cs="TH SarabunPSK"/>
+          <w:sz w:val="32"/>
+        </w:rPr>
+        <w:t xml:space="preserve"> for ubiquitous health monitoring on ESP32 microcontrollers," IEEE Internet Things J., vol. 9, no. 14, pp. 12450–12462</w:t>
+      </w:r>
+    </w:p>
+    <w:p>
+      <w:pPr>
+        <w:pStyle w:val="a9"/>
+        <w:spacing w:after="80"/>
+        <w:ind w:left="709" w:hanging="709"/>
+        <w:jc w:val="thaiDistribute"/>
+      </w:pPr>
+      <w:r>
+        <w:rPr>
+          <w:rFonts w:ascii="TH SarabunPSK" w:hAnsi="TH SarabunPSK" w:cs="TH SarabunPSK"/>
+          <w:sz w:val="32"/>
+        </w:rPr>
+        <w:t>[8]</w:t>
+      </w:r>
+      <w:r>
+        <w:rPr>
+          <w:rFonts w:ascii="TH SarabunPSK" w:hAnsi="TH SarabunPSK" w:cs="TH SarabunPSK"/>
+          <w:sz w:val="32"/>
+        </w:rPr>
+        <w:t xml:space="preserve"> </w:t>
+      </w:r>
+      <w:r>
+        <w:rPr>
+          <w:rFonts w:ascii="TH SarabunPSK" w:hAnsi="TH SarabunPSK" w:cs="TH SarabunPSK"/>
+          <w:sz w:val="32"/>
+        </w:rPr>
+        <w:t>F. Pedregosa et al.</w:t>
+      </w:r>
+      <w:r>
+        <w:rPr>
+          <w:rFonts w:ascii="TH SarabunPSK" w:hAnsi="TH SarabunPSK" w:cs="TH SarabunPSK"/>
+          <w:sz w:val="32"/>
+        </w:rPr>
+        <w:t>(2011)</w:t>
+      </w:r>
+      <w:r>
+        <w:rPr>
+          <w:rFonts w:ascii="TH SarabunPSK" w:hAnsi="TH SarabunPSK" w:cs="TH SarabunPSK"/>
+          <w:sz w:val="32"/>
+        </w:rPr>
+        <w:t>, "Scikit-learn: Machine learning in Python," J. Mach. Learn. Res., vol. 12, pp. 2825–2830,[Online]. Available: https://jmlr.org/papers/v12/</w:t>
+      </w:r>
+      <w:r>
+        <w:rPr>
+          <w:rFonts w:ascii="TH SarabunPSK" w:hAnsi="TH SarabunPSK" w:cs="TH SarabunPSK"/>
+          <w:sz w:val="32"/>
+        </w:rPr>
+        <w:br/>
+      </w:r>
+      <w:r>
+        <w:rPr>
+          <w:rFonts w:ascii="TH SarabunPSK" w:hAnsi="TH SarabunPSK" w:cs="TH SarabunPSK"/>
+          <w:sz w:val="32"/>
+        </w:rPr>
+        <w:t>pedregosa11a.html</w:t>
+      </w:r>
+      <w:r>
+        <w:t xml:space="preserve"> </w:t>
+      </w:r>
+      <w:r>
+        <w:rPr>
+          <w:rFonts w:ascii="TH SarabunPSK" w:hAnsi="TH SarabunPSK" w:cs="TH SarabunPSK"/>
+          <w:sz w:val="32"/>
+          <w:szCs w:val="32"/>
+        </w:rPr>
+        <w:t xml:space="preserve">[Accessed 7 </w:t>
+      </w:r>
+      <w:r>
+        <w:rPr>
+          <w:rFonts w:ascii="TH SarabunPSK" w:hAnsi="TH SarabunPSK" w:cs="TH SarabunPSK"/>
+          <w:sz w:val="32"/>
+          <w:szCs w:val="32"/>
+          <w:cs/>
+        </w:rPr>
+        <w:t>มิถุนายน 2569</w:t>
+      </w:r>
+      <w:r>
+        <w:rPr>
+          <w:rFonts w:ascii="TH SarabunPSK" w:hAnsi="TH SarabunPSK" w:cs="TH SarabunPSK"/>
+          <w:sz w:val="32"/>
+          <w:szCs w:val="32"/>
+        </w:rPr>
+        <w:t>]</w:t>
+      </w:r>
+    </w:p>
+    <w:p>
+      <w:pPr>
+        <w:pStyle w:val="a9"/>
+        <w:spacing w:after="80"/>
+        <w:ind w:left="709" w:hanging="709"/>
+        <w:jc w:val="thaiDistribute"/>
+      </w:pPr>
+      <w:r>
+        <w:rPr>
+          <w:rFonts w:ascii="TH SarabunPSK" w:hAnsi="TH SarabunPSK" w:cs="TH SarabunPSK"/>
+          <w:sz w:val="32"/>
+        </w:rPr>
+        <w:t>[9]</w:t>
+      </w:r>
+      <w:r>
+        <w:rPr>
+          <w:rFonts w:ascii="TH SarabunPSK" w:hAnsi="TH SarabunPSK" w:cs="TH SarabunPSK"/>
+          <w:sz w:val="32"/>
+        </w:rPr>
+        <w:t xml:space="preserve"> </w:t>
+      </w:r>
+      <w:r>
+        <w:rPr>
+          <w:rFonts w:ascii="TH SarabunPSK" w:hAnsi="TH SarabunPSK" w:cs="TH SarabunPSK"/>
+          <w:sz w:val="32"/>
+        </w:rPr>
+        <w:t>I. Goodfellow, Y. Bengio, and A. Courville</w:t>
+      </w:r>
+      <w:r>
+        <w:rPr>
+          <w:rFonts w:ascii="TH SarabunPSK" w:hAnsi="TH SarabunPSK" w:cs="TH SarabunPSK"/>
+          <w:sz w:val="32"/>
+        </w:rPr>
+        <w:t>(2016)</w:t>
+      </w:r>
+      <w:r>
+        <w:rPr>
+          <w:rFonts w:ascii="TH SarabunPSK" w:hAnsi="TH SarabunPSK" w:cs="TH SarabunPSK"/>
+          <w:sz w:val="32"/>
+        </w:rPr>
+        <w:t>,</w:t>
+      </w:r>
+      <w:r>
+        <w:rPr>
+          <w:rFonts w:ascii="TH SarabunPSK" w:hAnsi="TH SarabunPSK" w:cs="TH SarabunPSK"/>
+          <w:sz w:val="32"/>
+        </w:rPr>
+        <w:t>”</w:t>
+      </w:r>
+      <w:r>
+        <w:rPr>
+          <w:rFonts w:ascii="TH SarabunPSK" w:hAnsi="TH SarabunPSK" w:cs="TH SarabunPSK"/>
+          <w:sz w:val="32"/>
+        </w:rPr>
+        <w:t>Deep Learning</w:t>
+      </w:r>
+      <w:r>
+        <w:rPr>
+          <w:rFonts w:ascii="TH SarabunPSK" w:hAnsi="TH SarabunPSK" w:cs="TH SarabunPSK"/>
+          <w:sz w:val="32"/>
+        </w:rPr>
+        <w:t>”,</w:t>
+      </w:r>
+      <w:r>
+        <w:rPr>
+          <w:rFonts w:ascii="TH SarabunPSK" w:hAnsi="TH SarabunPSK" w:cs="TH SarabunPSK"/>
+          <w:sz w:val="32"/>
+        </w:rPr>
+        <w:t>[Online]. Available: http://www.deeplearningbook.org</w:t>
+      </w:r>
+      <w:r>
+        <w:t xml:space="preserve"> </w:t>
+      </w:r>
+      <w:r>
+        <w:rPr>
+          <w:rFonts w:ascii="TH SarabunPSK" w:hAnsi="TH SarabunPSK" w:cs="TH SarabunPSK"/>
+          <w:sz w:val="32"/>
+          <w:szCs w:val="32"/>
+        </w:rPr>
+        <w:t xml:space="preserve">[Accessed 7 </w:t>
+      </w:r>
+      <w:r>
+        <w:rPr>
+          <w:rFonts w:ascii="TH SarabunPSK" w:hAnsi="TH SarabunPSK" w:cs="TH SarabunPSK"/>
+          <w:sz w:val="32"/>
+          <w:szCs w:val="32"/>
+          <w:cs/>
+        </w:rPr>
+        <w:t>มิถุนายน 2569</w:t>
+      </w:r>
+      <w:r>
+        <w:rPr>
+          <w:rFonts w:ascii="TH SarabunPSK" w:hAnsi="TH SarabunPSK" w:cs="TH SarabunPSK"/>
+          <w:sz w:val="32"/>
+          <w:szCs w:val="32"/>
+        </w:rPr>
+        <w:t>]</w:t>
+      </w:r>
+    </w:p>
+    <w:p>
+      <w:pPr>
+        <w:pStyle w:val="a9"/>
+        <w:spacing w:after="80"/>
+        <w:ind w:left="709" w:hanging="709"/>
+        <w:jc w:val="thaiDistribute"/>
+      </w:pPr>
+      <w:r>
+        <w:rPr>
+          <w:rFonts w:ascii="TH SarabunPSK" w:hAnsi="TH SarabunPSK" w:cs="TH SarabunPSK"/>
+          <w:sz w:val="32"/>
+        </w:rPr>
+        <w:t>[10]</w:t>
+      </w:r>
+      <w:r>
+        <w:rPr>
+          <w:rFonts w:ascii="TH SarabunPSK" w:hAnsi="TH SarabunPSK" w:cs="TH SarabunPSK"/>
+          <w:sz w:val="32"/>
+        </w:rPr>
+        <w:t xml:space="preserve"> </w:t>
+      </w:r>
+      <w:proofErr w:type="spellStart"/>
+      <w:r>
+        <w:rPr>
+          <w:rFonts w:ascii="TH SarabunPSK" w:hAnsi="TH SarabunPSK" w:cs="TH SarabunPSK"/>
+          <w:sz w:val="32"/>
+        </w:rPr>
+        <w:t>Espressif</w:t>
+      </w:r>
+      <w:proofErr w:type="spellEnd"/>
+      <w:r>
+        <w:rPr>
+          <w:rFonts w:ascii="TH SarabunPSK" w:hAnsi="TH SarabunPSK" w:cs="TH SarabunPSK"/>
+          <w:sz w:val="32"/>
+        </w:rPr>
+        <w:t xml:space="preserve"> Systems</w:t>
+      </w:r>
+      <w:r>
+        <w:rPr>
+          <w:rFonts w:ascii="TH SarabunPSK" w:hAnsi="TH SarabunPSK" w:cs="TH SarabunPSK"/>
+          <w:sz w:val="32"/>
+        </w:rPr>
+        <w:t>(2023)</w:t>
+      </w:r>
+      <w:r>
+        <w:rPr>
+          <w:rFonts w:ascii="TH SarabunPSK" w:hAnsi="TH SarabunPSK" w:cs="TH SarabunPSK"/>
+          <w:sz w:val="32"/>
+        </w:rPr>
+        <w:t xml:space="preserve">, ESP32 Series Datasheet, Version 4.3, Shanghai, China: </w:t>
+      </w:r>
+      <w:proofErr w:type="spellStart"/>
+      <w:r>
+        <w:rPr>
+          <w:rFonts w:ascii="TH SarabunPSK" w:hAnsi="TH SarabunPSK" w:cs="TH SarabunPSK"/>
+          <w:sz w:val="32"/>
+        </w:rPr>
+        <w:t>Espressif</w:t>
+      </w:r>
+      <w:proofErr w:type="spellEnd"/>
+      <w:r>
+        <w:rPr>
+          <w:rFonts w:ascii="TH SarabunPSK" w:hAnsi="TH SarabunPSK" w:cs="TH SarabunPSK"/>
+          <w:sz w:val="32"/>
+        </w:rPr>
+        <w:t xml:space="preserve"> Systems, [Online]. </w:t>
+      </w:r>
+      <w:proofErr w:type="spellStart"/>
+      <w:r>
+        <w:rPr>
+          <w:rFonts w:ascii="TH SarabunPSK" w:hAnsi="TH SarabunPSK" w:cs="TH SarabunPSK"/>
+          <w:sz w:val="32"/>
+        </w:rPr>
+        <w:t>Available:https</w:t>
+      </w:r>
+      <w:proofErr w:type="spellEnd"/>
+      <w:r>
+        <w:rPr>
+          <w:rFonts w:ascii="TH SarabunPSK" w:hAnsi="TH SarabunPSK" w:cs="TH SarabunPSK"/>
+          <w:sz w:val="32"/>
+        </w:rPr>
+        <w:t>://www.espressif.com/sites/default/</w:t>
+      </w:r>
+      <w:r>
+        <w:rPr>
+          <w:rFonts w:ascii="TH SarabunPSK" w:hAnsi="TH SarabunPSK" w:cs="TH SarabunPSK"/>
+          <w:sz w:val="32"/>
+        </w:rPr>
+        <w:br/>
+      </w:r>
+      <w:r>
+        <w:rPr>
+          <w:rFonts w:ascii="TH SarabunPSK" w:hAnsi="TH SarabunPSK" w:cs="TH SarabunPSK"/>
+          <w:sz w:val="32"/>
+        </w:rPr>
+        <w:t>files/documentation/esp32_datasheet_en.pdf</w:t>
+      </w:r>
+      <w:r>
+        <w:t xml:space="preserve"> </w:t>
+      </w:r>
+      <w:r>
+        <w:rPr>
+          <w:rFonts w:ascii="TH SarabunPSK" w:hAnsi="TH SarabunPSK" w:cs="TH SarabunPSK"/>
+          <w:sz w:val="32"/>
+          <w:szCs w:val="32"/>
+        </w:rPr>
+        <w:t xml:space="preserve">[Accessed 7 </w:t>
+      </w:r>
+      <w:r>
+        <w:rPr>
+          <w:rFonts w:ascii="TH SarabunPSK" w:hAnsi="TH SarabunPSK" w:cs="TH SarabunPSK"/>
+          <w:sz w:val="32"/>
+          <w:szCs w:val="32"/>
+          <w:cs/>
+        </w:rPr>
+        <w:t>มิถุนายน 2569</w:t>
+      </w:r>
+      <w:r>
+        <w:rPr>
+          <w:rFonts w:ascii="TH SarabunPSK" w:hAnsi="TH SarabunPSK" w:cs="TH SarabunPSK"/>
+          <w:sz w:val="32"/>
+          <w:szCs w:val="32"/>
+        </w:rPr>
+        <w:t>]</w:t>
+      </w:r>
+    </w:p>
+    <w:p>
+      <w:pPr>
+        <w:pStyle w:val="a9"/>
+        <w:spacing w:after="80"/>
+        <w:ind w:left="709" w:hanging="709"/>
+        <w:jc w:val="thaiDistribute"/>
+        <w:rPr>
+          <w:rFonts w:ascii="TH SarabunPSK" w:hAnsi="TH SarabunPSK" w:cs="TH SarabunPSK"/>
+          <w:sz w:val="32"/>
+        </w:rPr>
       </w:pPr>
     </w:p>
+    <w:p>
+      <w:pPr>
+        <w:pStyle w:val="1"/>
+        <w:spacing w:before="0" w:line="240" w:lineRule="auto"/>
+        <w:jc w:val="center"/>
+        <w:rPr>
+          <w:sz w:val="32"/>
+          <w:szCs w:val="32"/>
+          <w:lang w:val="th-TH"/>
+        </w:rPr>
+      </w:pPr>
+      <w:r>
+        <w:rPr>
+          <w:sz w:val="32"/>
+          <w:szCs w:val="32"/>
+          <w:lang w:val="th-TH"/>
+        </w:rPr>
+        <w:lastRenderedPageBreak/>
+        <w:t>บรรณานุกรม</w:t>
+      </w:r>
+      <w:r>
+        <w:rPr>
+          <w:rFonts w:hint="cs"/>
+          <w:sz w:val="32"/>
+          <w:szCs w:val="32"/>
+          <w:lang w:val="th-TH"/>
+        </w:rPr>
+        <w:t xml:space="preserve"> (ต่อ)</w:t>
+      </w:r>
+    </w:p>
+    <w:p>
+      <w:pPr>
+        <w:pStyle w:val="a9"/>
+        <w:spacing w:after="80"/>
+        <w:ind w:left="709" w:hanging="709"/>
+        <w:jc w:val="thaiDistribute"/>
+        <w:rPr>
+          <w:rFonts w:ascii="TH SarabunPSK" w:hAnsi="TH SarabunPSK" w:cs="TH SarabunPSK"/>
+          <w:sz w:val="32"/>
+        </w:rPr>
+      </w:pPr>
+    </w:p>
+    <w:p>
+      <w:pPr>
+        <w:pStyle w:val="a9"/>
+        <w:spacing w:after="80"/>
+        <w:ind w:left="709" w:hanging="709"/>
+        <w:jc w:val="thaiDistribute"/>
+      </w:pPr>
+      <w:r>
+        <w:rPr>
+          <w:rFonts w:ascii="TH SarabunPSK" w:hAnsi="TH SarabunPSK" w:cs="TH SarabunPSK"/>
+          <w:sz w:val="32"/>
+        </w:rPr>
+        <w:t>[11]</w:t>
+      </w:r>
+      <w:r>
+        <w:rPr>
+          <w:rFonts w:ascii="TH SarabunPSK" w:hAnsi="TH SarabunPSK" w:cs="TH SarabunPSK"/>
+          <w:sz w:val="32"/>
+        </w:rPr>
+        <w:t xml:space="preserve"> </w:t>
+      </w:r>
+      <w:r>
+        <w:rPr>
+          <w:rFonts w:ascii="TH SarabunPSK" w:hAnsi="TH SarabunPSK" w:cs="TH SarabunPSK"/>
+          <w:sz w:val="32"/>
+        </w:rPr>
+        <w:t xml:space="preserve">F. </w:t>
+      </w:r>
+      <w:proofErr w:type="spellStart"/>
+      <w:r>
+        <w:rPr>
+          <w:rFonts w:ascii="TH SarabunPSK" w:hAnsi="TH SarabunPSK" w:cs="TH SarabunPSK"/>
+          <w:sz w:val="32"/>
+        </w:rPr>
+        <w:t>Bagalà</w:t>
+      </w:r>
+      <w:proofErr w:type="spellEnd"/>
+      <w:r>
+        <w:rPr>
+          <w:rFonts w:ascii="TH SarabunPSK" w:hAnsi="TH SarabunPSK" w:cs="TH SarabunPSK"/>
+          <w:sz w:val="32"/>
+        </w:rPr>
+        <w:t xml:space="preserve"> et al.</w:t>
+      </w:r>
+      <w:r>
+        <w:rPr>
+          <w:rFonts w:ascii="TH SarabunPSK" w:hAnsi="TH SarabunPSK" w:cs="TH SarabunPSK"/>
+          <w:sz w:val="32"/>
+        </w:rPr>
+        <w:t>(2012)</w:t>
+      </w:r>
+      <w:r>
+        <w:rPr>
+          <w:rFonts w:ascii="TH SarabunPSK" w:hAnsi="TH SarabunPSK" w:cs="TH SarabunPSK"/>
+          <w:sz w:val="32"/>
+        </w:rPr>
+        <w:t>, "Evaluation of accelerometer-based fall detection algorithms on real-world falls,"</w:t>
+      </w:r>
+      <w:r>
+        <w:rPr>
+          <w:rFonts w:ascii="TH SarabunPSK" w:hAnsi="TH SarabunPSK" w:cs="TH SarabunPSK"/>
+          <w:sz w:val="32"/>
+        </w:rPr>
+        <w:t xml:space="preserve"> [Online]. </w:t>
+      </w:r>
+      <w:proofErr w:type="spellStart"/>
+      <w:r>
+        <w:rPr>
+          <w:rFonts w:ascii="TH SarabunPSK" w:hAnsi="TH SarabunPSK" w:cs="TH SarabunPSK"/>
+          <w:sz w:val="32"/>
+        </w:rPr>
+        <w:t>Available:</w:t>
+      </w:r>
+      <w:r>
+        <w:rPr>
+          <w:rFonts w:ascii="TH SarabunPSK" w:hAnsi="TH SarabunPSK" w:cs="TH SarabunPSK"/>
+          <w:sz w:val="32"/>
+          <w:szCs w:val="40"/>
+        </w:rPr>
+        <w:t>https</w:t>
+      </w:r>
+      <w:proofErr w:type="spellEnd"/>
+      <w:r>
+        <w:rPr>
+          <w:rFonts w:ascii="TH SarabunPSK" w:hAnsi="TH SarabunPSK" w:cs="TH SarabunPSK"/>
+          <w:sz w:val="32"/>
+          <w:szCs w:val="40"/>
+        </w:rPr>
+        <w:t>://journals.plos.org/</w:t>
+      </w:r>
+      <w:proofErr w:type="spellStart"/>
+      <w:r>
+        <w:rPr>
+          <w:rFonts w:ascii="TH SarabunPSK" w:hAnsi="TH SarabunPSK" w:cs="TH SarabunPSK"/>
+          <w:sz w:val="32"/>
+          <w:szCs w:val="40"/>
+        </w:rPr>
+        <w:t>plosone</w:t>
+      </w:r>
+      <w:proofErr w:type="spellEnd"/>
+      <w:r>
+        <w:rPr>
+          <w:rFonts w:ascii="TH SarabunPSK" w:hAnsi="TH SarabunPSK" w:cs="TH SarabunPSK"/>
+          <w:sz w:val="32"/>
+          <w:szCs w:val="40"/>
+        </w:rPr>
+        <w:t>/</w:t>
+      </w:r>
+      <w:r>
+        <w:rPr>
+          <w:rFonts w:ascii="TH SarabunPSK" w:hAnsi="TH SarabunPSK" w:cs="TH SarabunPSK"/>
+          <w:sz w:val="32"/>
+          <w:szCs w:val="40"/>
+        </w:rPr>
+        <w:br/>
+      </w:r>
+      <w:proofErr w:type="spellStart"/>
+      <w:r>
+        <w:rPr>
+          <w:rFonts w:ascii="TH SarabunPSK" w:hAnsi="TH SarabunPSK" w:cs="TH SarabunPSK"/>
+          <w:sz w:val="32"/>
+          <w:szCs w:val="40"/>
+        </w:rPr>
+        <w:t>article?id</w:t>
+      </w:r>
+      <w:proofErr w:type="spellEnd"/>
+      <w:r>
+        <w:rPr>
+          <w:rFonts w:ascii="TH SarabunPSK" w:hAnsi="TH SarabunPSK" w:cs="TH SarabunPSK"/>
+          <w:sz w:val="32"/>
+          <w:szCs w:val="40"/>
+        </w:rPr>
+        <w:t xml:space="preserve">=10.1371/journal.pone.0037062  </w:t>
+      </w:r>
+      <w:r>
+        <w:rPr>
+          <w:rFonts w:ascii="TH SarabunPSK" w:hAnsi="TH SarabunPSK" w:cs="TH SarabunPSK"/>
+          <w:sz w:val="32"/>
+          <w:szCs w:val="32"/>
+        </w:rPr>
+        <w:t xml:space="preserve">[Accessed 7 </w:t>
+      </w:r>
+      <w:r>
+        <w:rPr>
+          <w:rFonts w:ascii="TH SarabunPSK" w:hAnsi="TH SarabunPSK" w:cs="TH SarabunPSK"/>
+          <w:sz w:val="32"/>
+          <w:szCs w:val="32"/>
+          <w:cs/>
+        </w:rPr>
+        <w:t>มิถุนายน 2569</w:t>
+      </w:r>
+      <w:r>
+        <w:rPr>
+          <w:rFonts w:ascii="TH SarabunPSK" w:hAnsi="TH SarabunPSK" w:cs="TH SarabunPSK"/>
+          <w:sz w:val="32"/>
+          <w:szCs w:val="32"/>
+        </w:rPr>
+        <w:t>]</w:t>
+      </w:r>
+    </w:p>
+    <w:p>
+      <w:pPr>
+        <w:pStyle w:val="a9"/>
+        <w:spacing w:after="80"/>
+        <w:ind w:left="709" w:hanging="709"/>
+        <w:jc w:val="thaiDistribute"/>
+      </w:pPr>
+      <w:r>
+        <w:rPr>
+          <w:rFonts w:ascii="TH SarabunPSK" w:hAnsi="TH SarabunPSK" w:cs="TH SarabunPSK"/>
+          <w:sz w:val="32"/>
+        </w:rPr>
+        <w:t>[12]</w:t>
+      </w:r>
+      <w:r>
+        <w:rPr>
+          <w:rFonts w:ascii="TH SarabunPSK" w:hAnsi="TH SarabunPSK" w:cs="TH SarabunPSK"/>
+          <w:sz w:val="32"/>
+        </w:rPr>
+        <w:t xml:space="preserve"> </w:t>
+      </w:r>
+      <w:r>
+        <w:rPr>
+          <w:rFonts w:ascii="TH SarabunPSK" w:hAnsi="TH SarabunPSK" w:cs="TH SarabunPSK"/>
+          <w:sz w:val="32"/>
+        </w:rPr>
+        <w:t>L. Martínez-Villaseñor et al.</w:t>
+      </w:r>
+      <w:r>
+        <w:rPr>
+          <w:rFonts w:ascii="TH SarabunPSK" w:hAnsi="TH SarabunPSK" w:cs="TH SarabunPSK"/>
+          <w:sz w:val="32"/>
+        </w:rPr>
+        <w:t>(2019)</w:t>
+      </w:r>
+      <w:r>
+        <w:rPr>
+          <w:rFonts w:ascii="TH SarabunPSK" w:hAnsi="TH SarabunPSK" w:cs="TH SarabunPSK"/>
+          <w:sz w:val="32"/>
+        </w:rPr>
+        <w:t>, "UP-Fall detection dataset: A multimodal approach,"</w:t>
+      </w:r>
+      <w:r>
+        <w:rPr>
+          <w:rFonts w:ascii="TH SarabunPSK" w:hAnsi="TH SarabunPSK" w:cs="TH SarabunPSK"/>
+          <w:sz w:val="32"/>
+        </w:rPr>
+        <w:t xml:space="preserve"> [Online]. </w:t>
+      </w:r>
+      <w:proofErr w:type="spellStart"/>
+      <w:r>
+        <w:rPr>
+          <w:rFonts w:ascii="TH SarabunPSK" w:hAnsi="TH SarabunPSK" w:cs="TH SarabunPSK"/>
+          <w:sz w:val="32"/>
+        </w:rPr>
+        <w:t>Available:</w:t>
+      </w:r>
+      <w:r>
+        <w:rPr>
+          <w:rFonts w:ascii="TH SarabunPSK" w:hAnsi="TH SarabunPSK" w:cs="TH SarabunPSK"/>
+          <w:sz w:val="32"/>
+          <w:szCs w:val="40"/>
+        </w:rPr>
+        <w:t>https</w:t>
+      </w:r>
+      <w:proofErr w:type="spellEnd"/>
+      <w:r>
+        <w:rPr>
+          <w:rFonts w:ascii="TH SarabunPSK" w:hAnsi="TH SarabunPSK" w:cs="TH SarabunPSK"/>
+          <w:sz w:val="32"/>
+          <w:szCs w:val="40"/>
+        </w:rPr>
+        <w:t xml:space="preserve">://pubmed.ncbi.nlm.nih.gov/31035377/ </w:t>
+      </w:r>
+      <w:r>
+        <w:rPr>
+          <w:rFonts w:ascii="TH SarabunPSK" w:hAnsi="TH SarabunPSK" w:cs="TH SarabunPSK"/>
+          <w:sz w:val="44"/>
+          <w:szCs w:val="52"/>
+        </w:rPr>
+        <w:t xml:space="preserve"> </w:t>
+      </w:r>
+      <w:r>
+        <w:rPr>
+          <w:rFonts w:ascii="TH SarabunPSK" w:hAnsi="TH SarabunPSK" w:cs="TH SarabunPSK"/>
+          <w:sz w:val="32"/>
+          <w:szCs w:val="32"/>
+        </w:rPr>
+        <w:t xml:space="preserve">[Accessed 7 </w:t>
+      </w:r>
+      <w:r>
+        <w:rPr>
+          <w:rFonts w:ascii="TH SarabunPSK" w:hAnsi="TH SarabunPSK" w:cs="TH SarabunPSK"/>
+          <w:sz w:val="32"/>
+          <w:szCs w:val="32"/>
+          <w:cs/>
+        </w:rPr>
+        <w:t>มิถุนายน 2569</w:t>
+      </w:r>
+      <w:r>
+        <w:rPr>
+          <w:rFonts w:ascii="TH SarabunPSK" w:hAnsi="TH SarabunPSK" w:cs="TH SarabunPSK"/>
+          <w:sz w:val="32"/>
+          <w:szCs w:val="32"/>
+        </w:rPr>
+        <w:t>]</w:t>
+      </w:r>
+    </w:p>
+    <w:p>
+      <w:pPr>
+        <w:pStyle w:val="a9"/>
+        <w:spacing w:after="80"/>
+        <w:ind w:left="709" w:hanging="709"/>
+        <w:jc w:val="thaiDistribute"/>
+      </w:pPr>
+      <w:r>
+        <w:rPr>
+          <w:rFonts w:ascii="TH SarabunPSK" w:hAnsi="TH SarabunPSK" w:cs="TH SarabunPSK"/>
+          <w:sz w:val="32"/>
+        </w:rPr>
+        <w:t>[13]</w:t>
+      </w:r>
+      <w:r>
+        <w:rPr>
+          <w:rFonts w:ascii="TH SarabunPSK" w:hAnsi="TH SarabunPSK" w:cs="TH SarabunPSK"/>
+          <w:sz w:val="32"/>
+        </w:rPr>
+        <w:t xml:space="preserve"> </w:t>
+      </w:r>
+      <w:r>
+        <w:rPr>
+          <w:rFonts w:ascii="TH SarabunPSK" w:hAnsi="TH SarabunPSK" w:cs="TH SarabunPSK"/>
+          <w:sz w:val="32"/>
+        </w:rPr>
+        <w:t>X. Yu, J. Jang, and S. Xiong</w:t>
+      </w:r>
+      <w:r>
+        <w:rPr>
+          <w:rFonts w:ascii="TH SarabunPSK" w:hAnsi="TH SarabunPSK" w:cs="TH SarabunPSK"/>
+          <w:sz w:val="32"/>
+        </w:rPr>
+        <w:t>(2021)</w:t>
+      </w:r>
+      <w:r>
+        <w:rPr>
+          <w:rFonts w:ascii="TH SarabunPSK" w:hAnsi="TH SarabunPSK" w:cs="TH SarabunPSK"/>
+          <w:sz w:val="32"/>
+        </w:rPr>
+        <w:t>, "A large-scale open motion dataset (</w:t>
+      </w:r>
+      <w:proofErr w:type="spellStart"/>
+      <w:r>
+        <w:rPr>
+          <w:rFonts w:ascii="TH SarabunPSK" w:hAnsi="TH SarabunPSK" w:cs="TH SarabunPSK"/>
+          <w:sz w:val="32"/>
+        </w:rPr>
+        <w:t>KFall</w:t>
+      </w:r>
+      <w:proofErr w:type="spellEnd"/>
+      <w:r>
+        <w:rPr>
+          <w:rFonts w:ascii="TH SarabunPSK" w:hAnsi="TH SarabunPSK" w:cs="TH SarabunPSK"/>
+          <w:sz w:val="32"/>
+        </w:rPr>
+        <w:t>) and benchmark algorithms for detecting pre-impact fall of the elderly using wearable inertial sensors,"</w:t>
+      </w:r>
+      <w:r>
+        <w:rPr>
+          <w:rFonts w:ascii="TH SarabunPSK" w:hAnsi="TH SarabunPSK" w:cs="TH SarabunPSK"/>
+          <w:sz w:val="32"/>
+        </w:rPr>
+        <w:t xml:space="preserve"> [Online]. </w:t>
+      </w:r>
+      <w:proofErr w:type="spellStart"/>
+      <w:r>
+        <w:rPr>
+          <w:rFonts w:ascii="TH SarabunPSK" w:hAnsi="TH SarabunPSK" w:cs="TH SarabunPSK"/>
+          <w:sz w:val="32"/>
+        </w:rPr>
+        <w:t>Available:</w:t>
+      </w:r>
+      <w:r>
+        <w:rPr>
+          <w:rFonts w:ascii="TH SarabunPSK" w:hAnsi="TH SarabunPSK" w:cs="TH SarabunPSK"/>
+          <w:sz w:val="32"/>
+          <w:szCs w:val="32"/>
+        </w:rPr>
+        <w:t>https</w:t>
+      </w:r>
+      <w:proofErr w:type="spellEnd"/>
+      <w:r>
+        <w:rPr>
+          <w:rFonts w:ascii="TH SarabunPSK" w:hAnsi="TH SarabunPSK" w:cs="TH SarabunPSK"/>
+          <w:sz w:val="32"/>
+          <w:szCs w:val="32"/>
+        </w:rPr>
+        <w:t>://www.frontiersin.org/</w:t>
+      </w:r>
+      <w:r>
+        <w:rPr>
+          <w:rFonts w:ascii="TH SarabunPSK" w:hAnsi="TH SarabunPSK" w:cs="TH SarabunPSK"/>
+          <w:sz w:val="32"/>
+          <w:szCs w:val="32"/>
+        </w:rPr>
+        <w:br/>
+        <w:t>journals/aging-neuroscience/articles/10.3389/fnagi.2021.692865/pdf</w:t>
+      </w:r>
+      <w:r>
+        <w:t xml:space="preserve"> </w:t>
+      </w:r>
+      <w:r>
+        <w:rPr>
+          <w:rFonts w:ascii="TH SarabunPSK" w:hAnsi="TH SarabunPSK" w:cs="TH SarabunPSK"/>
+          <w:sz w:val="32"/>
+          <w:szCs w:val="32"/>
+        </w:rPr>
+        <w:t xml:space="preserve">[Accessed 7 </w:t>
+      </w:r>
+      <w:r>
+        <w:rPr>
+          <w:rFonts w:ascii="TH SarabunPSK" w:hAnsi="TH SarabunPSK" w:cs="TH SarabunPSK"/>
+          <w:sz w:val="32"/>
+          <w:szCs w:val="32"/>
+          <w:cs/>
+        </w:rPr>
+        <w:t>มิถุนายน 2569</w:t>
+      </w:r>
+      <w:r>
+        <w:rPr>
+          <w:rFonts w:ascii="TH SarabunPSK" w:hAnsi="TH SarabunPSK" w:cs="TH SarabunPSK"/>
+          <w:sz w:val="32"/>
+          <w:szCs w:val="32"/>
+        </w:rPr>
+        <w:t>]</w:t>
+      </w:r>
+    </w:p>
+    <w:p>
+      <w:pPr>
+        <w:pStyle w:val="a9"/>
+        <w:spacing w:after="80"/>
+        <w:ind w:left="709" w:hanging="709"/>
+        <w:jc w:val="thaiDistribute"/>
+      </w:pPr>
+      <w:r>
+        <w:rPr>
+          <w:rFonts w:ascii="TH SarabunPSK" w:hAnsi="TH SarabunPSK" w:cs="TH SarabunPSK"/>
+          <w:sz w:val="32"/>
+        </w:rPr>
+        <w:t>[14]</w:t>
+      </w:r>
+      <w:r>
+        <w:rPr>
+          <w:rFonts w:ascii="TH SarabunPSK" w:hAnsi="TH SarabunPSK" w:cs="TH SarabunPSK"/>
+          <w:sz w:val="32"/>
+        </w:rPr>
+        <w:t xml:space="preserve"> </w:t>
+      </w:r>
+      <w:r>
+        <w:rPr>
+          <w:rFonts w:ascii="TH SarabunPSK" w:hAnsi="TH SarabunPSK" w:cs="TH SarabunPSK"/>
+          <w:sz w:val="32"/>
+        </w:rPr>
+        <w:t>A. K. Bourke, J. V. O'Brien, and G. M. Lyons</w:t>
+      </w:r>
+      <w:r>
+        <w:rPr>
+          <w:rFonts w:ascii="TH SarabunPSK" w:hAnsi="TH SarabunPSK" w:cs="TH SarabunPSK"/>
+          <w:sz w:val="32"/>
+        </w:rPr>
+        <w:t>(2007)</w:t>
+      </w:r>
+      <w:r>
+        <w:rPr>
+          <w:rFonts w:ascii="TH SarabunPSK" w:hAnsi="TH SarabunPSK" w:cs="TH SarabunPSK"/>
+          <w:sz w:val="32"/>
+        </w:rPr>
+        <w:t>, "Evaluation of a threshold-based tri-axial accelerometer fall detection algorithm,"</w:t>
+      </w:r>
+      <w:r>
+        <w:rPr>
+          <w:rFonts w:ascii="TH SarabunPSK" w:hAnsi="TH SarabunPSK" w:cs="TH SarabunPSK"/>
+          <w:sz w:val="32"/>
+        </w:rPr>
+        <w:t xml:space="preserve"> [Online]. </w:t>
+      </w:r>
+      <w:proofErr w:type="spellStart"/>
+      <w:r>
+        <w:rPr>
+          <w:rFonts w:ascii="TH SarabunPSK" w:hAnsi="TH SarabunPSK" w:cs="TH SarabunPSK"/>
+          <w:sz w:val="32"/>
+        </w:rPr>
+        <w:t>Available:https</w:t>
+      </w:r>
+      <w:proofErr w:type="spellEnd"/>
+      <w:r>
+        <w:rPr>
+          <w:rFonts w:ascii="TH SarabunPSK" w:hAnsi="TH SarabunPSK" w:cs="TH SarabunPSK"/>
+          <w:sz w:val="32"/>
+        </w:rPr>
+        <w:t>://</w:t>
+      </w:r>
+      <w:r>
+        <w:rPr>
+          <w:rFonts w:ascii="TH SarabunPSK" w:hAnsi="TH SarabunPSK" w:cs="TH SarabunPSK"/>
+          <w:sz w:val="32"/>
+        </w:rPr>
+        <w:br/>
+        <w:t>www.academia.edu/31695380/Evaluation_of_a_threshold_based_tri_axial_accelerometer_fall_detection_algorithm</w:t>
+      </w:r>
+      <w:r>
+        <w:t xml:space="preserve"> </w:t>
+      </w:r>
+      <w:r>
+        <w:rPr>
+          <w:rFonts w:ascii="TH SarabunPSK" w:hAnsi="TH SarabunPSK" w:cs="TH SarabunPSK"/>
+          <w:sz w:val="32"/>
+          <w:szCs w:val="32"/>
+        </w:rPr>
+        <w:t xml:space="preserve">[Accessed 7 </w:t>
+      </w:r>
+      <w:r>
+        <w:rPr>
+          <w:rFonts w:ascii="TH SarabunPSK" w:hAnsi="TH SarabunPSK" w:cs="TH SarabunPSK"/>
+          <w:sz w:val="32"/>
+          <w:szCs w:val="32"/>
+          <w:cs/>
+        </w:rPr>
+        <w:t>มิถุนายน 2569</w:t>
+      </w:r>
+      <w:r>
+        <w:rPr>
+          <w:rFonts w:ascii="TH SarabunPSK" w:hAnsi="TH SarabunPSK" w:cs="TH SarabunPSK"/>
+          <w:sz w:val="32"/>
+          <w:szCs w:val="32"/>
+        </w:rPr>
+        <w:t>]</w:t>
+      </w:r>
+    </w:p>
     <w:sectPr>
-      <w:headerReference w:type="default" r:id="rId22"/>
+      <w:headerReference w:type="default" r:id="rId10"/>
+      <w:headerReference w:type="first" r:id="rId11"/>
       <w:pgSz w:w="11906" w:h="16838" w:code="9"/>
       <w:pgMar w:top="2160" w:right="1440" w:bottom="1440" w:left="2160" w:header="1440" w:footer="709" w:gutter="0"/>
-      <w:pgNumType w:start="13"/>
+      <w:pgNumType w:start="80"/>
       <w:cols w:space="708"/>
       <w:titlePg/>
       <w:docGrid w:linePitch="435"/>
@@ -1415,6 +1752,51 @@
       </w:p>
     </w:sdtContent>
   </w:sdt>
+</w:hdr>
+</file>
+
+<file path=word/header2.xml><?xml version="1.0" encoding="utf-8"?>
+<w:hdr xmlns:wpc="http://schemas.microsoft.com/office/word/2010/wordprocessingCanvas" xmlns:cx="http://schemas.microsoft.com/office/drawing/2014/chartex" xmlns:cx1="http://schemas.microsoft.com/office/drawing/2015/9/8/chartex" xmlns:cx2="http://schemas.microsoft.com/office/drawing/2015/10/21/chartex" xmlns:cx3="http://schemas.microsoft.com/office/drawing/2016/5/9/chartex" xmlns:cx4="http://schemas.microsoft.com/office/drawing/2016/5/10/chartex" xmlns:cx5="http://schemas.microsoft.com/office/drawing/2016/5/11/chartex" xmlns:cx6="http://schemas.microsoft.com/office/drawing/2016/5/12/chartex" xmlns:cx7="http://schemas.microsoft.com/office/drawing/2016/5/13/chartex" xmlns:cx8="http://schemas.microsoft.com/office/drawing/2016/5/14/chartex" xmlns:mc="http://schemas.openxmlformats.org/markup-compatibility/2006" xmlns:aink="http://schemas.microsoft.com/office/drawing/2016/ink" xmlns:am3d="http://schemas.microsoft.com/office/drawing/2017/model3d" xmlns:o="urn:schemas-microsoft-com:office:office" xmlns:oel="http://schemas.microsoft.com/office/2019/extlst" xmlns:r="http://schemas.openxmlformats.org/officeDocument/2006/relationships" xmlns:m="http://schemas.openxmlformats.org/officeDocument/2006/math" xmlns:v="urn:schemas-microsoft-com:vml" xmlns:wp14="http://schemas.microsoft.com/office/word/2010/wordprocessingDrawing" xmlns:wp="http://schemas.openxmlformats.org/drawingml/2006/wordprocessingDrawing" xmlns:w10="urn:schemas-microsoft-com:office:word" xmlns:w="http://schemas.openxmlformats.org/wordprocessingml/2006/main" xmlns:w14="http://schemas.microsoft.com/office/word/2010/wordml" xmlns:w15="http://schemas.microsoft.com/office/word/2012/wordml" xmlns:w16cex="http://schemas.microsoft.com/office/word/2018/wordml/cex" xmlns:w16cid="http://schemas.microsoft.com/office/word/2016/wordml/cid" xmlns:w16="http://schemas.microsoft.com/office/word/2018/wordml" xmlns:w16du="http://schemas.microsoft.com/office/word/2023/wordml/word16du" xmlns:w16sdtdh="http://schemas.microsoft.com/office/word/2020/wordml/sdtdatahash" xmlns:w16sdtfl="http://schemas.microsoft.com/office/word/2024/wordml/sdtformatlock" xmlns:w16se="http://schemas.microsoft.com/office/word/2015/wordml/symex" xmlns:wpg="http://schemas.microsoft.com/office/word/2010/wordprocessingGroup" xmlns:wpi="http://schemas.microsoft.com/office/word/2010/wordprocessingInk" xmlns:wne="http://schemas.microsoft.com/office/word/2006/wordml" xmlns:wps="http://schemas.microsoft.com/office/word/2010/wordprocessingShape" mc:Ignorable="w14 w15 w16se w16cid w16 w16cex w16sdtdh w16sdtfl w16du wp14">
+  <w:sdt>
+    <w:sdtPr>
+      <w:id w:val="2007634471"/>
+      <w:docPartObj>
+        <w:docPartGallery w:val="Page Numbers (Top of Page)"/>
+        <w:docPartUnique/>
+      </w:docPartObj>
+    </w:sdtPr>
+    <w:sdtContent>
+      <w:p>
+        <w:pPr>
+          <w:pStyle w:val="a3"/>
+          <w:jc w:val="right"/>
+        </w:pPr>
+        <w:r>
+          <w:fldChar w:fldCharType="begin"/>
+        </w:r>
+        <w:r>
+          <w:instrText>PAGE   \* MERGEFORMAT</w:instrText>
+        </w:r>
+        <w:r>
+          <w:fldChar w:fldCharType="separate"/>
+        </w:r>
+        <w:r>
+          <w:rPr>
+            <w:lang w:val="th-TH"/>
+          </w:rPr>
+          <w:t>2</w:t>
+        </w:r>
+        <w:r>
+          <w:fldChar w:fldCharType="end"/>
+        </w:r>
+      </w:p>
+    </w:sdtContent>
+  </w:sdt>
+  <w:p>
+    <w:pPr>
+      <w:pStyle w:val="a3"/>
+    </w:pPr>
+  </w:p>
 </w:hdr>
 </file>
 
@@ -1868,6 +2250,7 @@
   <w:style w:type="character" w:default="1" w:styleId="a0">
     <w:name w:val="Default Paragraph Font"/>
     <w:uiPriority w:val="1"/>
+    <w:semiHidden/>
     <w:unhideWhenUsed/>
   </w:style>
   <w:style w:type="table" w:default="1" w:styleId="a1">
@@ -2551,26 +2934,6 @@
 </file>
 
 <file path=customXml/item2.xml><?xml version="1.0" encoding="utf-8"?>
-<p:properties xmlns:p="http://schemas.microsoft.com/office/2006/metadata/properties" xmlns:xsi="http://www.w3.org/2001/XMLSchema-instance" xmlns:pc="http://schemas.microsoft.com/office/infopath/2007/PartnerControls">
-  <documentManagement>
-    <lcf76f155ced4ddcb4097134ff3c332f xmlns="413aea6a-afdb-4d88-b833-b2462709287e">
-      <Terms xmlns="http://schemas.microsoft.com/office/infopath/2007/PartnerControls"/>
-    </lcf76f155ced4ddcb4097134ff3c332f>
-    <TaxCatchAll xmlns="eb0c45c8-85b6-4e00-a5af-15633ec3585f" xsi:nil="true"/>
-  </documentManagement>
-</p:properties>
-</file>
-
-<file path=customXml/item3.xml><?xml version="1.0" encoding="utf-8"?>
-<?mso-contentType ?>
-<FormTemplates xmlns="http://schemas.microsoft.com/sharepoint/v3/contenttype/forms">
-  <Display>DocumentLibraryForm</Display>
-  <Edit>DocumentLibraryForm</Edit>
-  <New>DocumentLibraryForm</New>
-</FormTemplates>
-</file>
-
-<file path=customXml/item4.xml><?xml version="1.0" encoding="utf-8"?>
 <b:Sources xmlns:b="http://schemas.openxmlformats.org/officeDocument/2006/bibliography" xmlns="http://schemas.openxmlformats.org/officeDocument/2006/bibliography" SelectedStyle="\APASeventhEdition.xsl" StyleName="APA" Version="7">
   <b:Source>
     <b:Tag>ศุภ55</b:Tag>
@@ -3146,6 +3509,26 @@
 </b:Sources>
 </file>
 
+<file path=customXml/item3.xml><?xml version="1.0" encoding="utf-8"?>
+<?mso-contentType ?>
+<FormTemplates xmlns="http://schemas.microsoft.com/sharepoint/v3/contenttype/forms">
+  <Display>DocumentLibraryForm</Display>
+  <Edit>DocumentLibraryForm</Edit>
+  <New>DocumentLibraryForm</New>
+</FormTemplates>
+</file>
+
+<file path=customXml/item4.xml><?xml version="1.0" encoding="utf-8"?>
+<p:properties xmlns:p="http://schemas.microsoft.com/office/2006/metadata/properties" xmlns:xsi="http://www.w3.org/2001/XMLSchema-instance" xmlns:pc="http://schemas.microsoft.com/office/infopath/2007/PartnerControls">
+  <documentManagement>
+    <lcf76f155ced4ddcb4097134ff3c332f xmlns="413aea6a-afdb-4d88-b833-b2462709287e">
+      <Terms xmlns="http://schemas.microsoft.com/office/infopath/2007/PartnerControls"/>
+    </lcf76f155ced4ddcb4097134ff3c332f>
+    <TaxCatchAll xmlns="eb0c45c8-85b6-4e00-a5af-15633ec3585f" xsi:nil="true"/>
+  </documentManagement>
+</p:properties>
+</file>
+
 <file path=customXml/itemProps1.xml><?xml version="1.0" encoding="utf-8"?>
 <ds:datastoreItem xmlns:ds="http://schemas.openxmlformats.org/officeDocument/2006/customXml" ds:itemID="{6308CA7B-5321-4486-BC6C-E597FB96982F}">
   <ds:schemaRefs>
@@ -3166,12 +3549,9 @@
 </file>
 
 <file path=customXml/itemProps2.xml><?xml version="1.0" encoding="utf-8"?>
-<ds:datastoreItem xmlns:ds="http://schemas.openxmlformats.org/officeDocument/2006/customXml" ds:itemID="{D983E28F-9429-49DE-A63E-7174A79DCB16}">
+<ds:datastoreItem xmlns:ds="http://schemas.openxmlformats.org/officeDocument/2006/customXml" ds:itemID="{7605E9F6-E681-48B3-B7B9-D0E710EA9D78}">
   <ds:schemaRefs>
-    <ds:schemaRef ds:uri="http://schemas.microsoft.com/office/2006/metadata/properties"/>
-    <ds:schemaRef ds:uri="http://schemas.microsoft.com/office/infopath/2007/PartnerControls"/>
-    <ds:schemaRef ds:uri="413aea6a-afdb-4d88-b833-b2462709287e"/>
-    <ds:schemaRef ds:uri="eb0c45c8-85b6-4e00-a5af-15633ec3585f"/>
+    <ds:schemaRef ds:uri="http://schemas.openxmlformats.org/officeDocument/2006/bibliography"/>
   </ds:schemaRefs>
 </ds:datastoreItem>
 </file>
@@ -3185,9 +3565,12 @@
 </file>
 
 <file path=customXml/itemProps4.xml><?xml version="1.0" encoding="utf-8"?>
-<ds:datastoreItem xmlns:ds="http://schemas.openxmlformats.org/officeDocument/2006/customXml" ds:itemID="{7605E9F6-E681-48B3-B7B9-D0E710EA9D78}">
+<ds:datastoreItem xmlns:ds="http://schemas.openxmlformats.org/officeDocument/2006/customXml" ds:itemID="{D983E28F-9429-49DE-A63E-7174A79DCB16}">
   <ds:schemaRefs>
-    <ds:schemaRef ds:uri="http://schemas.openxmlformats.org/officeDocument/2006/bibliography"/>
+    <ds:schemaRef ds:uri="http://schemas.microsoft.com/office/2006/metadata/properties"/>
+    <ds:schemaRef ds:uri="http://schemas.microsoft.com/office/infopath/2007/PartnerControls"/>
+    <ds:schemaRef ds:uri="413aea6a-afdb-4d88-b833-b2462709287e"/>
+    <ds:schemaRef ds:uri="eb0c45c8-85b6-4e00-a5af-15633ec3585f"/>
   </ds:schemaRefs>
 </ds:datastoreItem>
 </file>
</xml_diff>